<commit_message>
feat: add sensor components and installation slides for AMG8833, DHT22, MPU-6050, and SCT-013
- Created SensorAMG, SensorDHT, SensorMPU, and SensorSCT components to display specifications.
- Added corresponding installation slides: SensorAMGInstall, SensorDHTInstall, SensorMPUInstall, and SensorSCTInstall.
- Implemented SensorSpec and SensorInstall components for reusable sensor specification and installation layouts.
- Updated Stack slide with new logos for tech stack items.
- Introduced UML class and use case diagrams slides.
- Enhanced Web_Fonctionnalites slide with updated feature descriptions.
- Improved global styles for fullscreen presentation and added synchronization functionality between presenter and deck.
</commit_message>
<xml_diff>
--- a/SPEECH_FR.docx
+++ b/SPEECH_FR.docx
@@ -30,7 +30,7 @@
           <w:color w:val="404040"/>
           <w:sz w:val="40"/>
         </w:rPr>
-        <w:t>Soutenance PFE — Deck 33 slides</w:t>
+        <w:t>Soutenance PFE — Deck 43 slides</w:t>
       </w:r>
     </w:p>
     <w:p>
@@ -181,7 +181,7 @@
           <w:color w:val="404040"/>
           <w:sz w:val="22"/>
         </w:rPr>
-        <w:t>Texte prêt à réciter — 33 slides · ~20 min</w:t>
+        <w:t>Texte prêt à réciter — 43 slides · ~25 min</w:t>
       </w:r>
     </w:p>
     <w:p>
@@ -281,7 +281,7 @@
           <w:color w:val="000000"/>
           <w:sz w:val="23"/>
         </w:rPr>
-        <w:t xml:space="preserve"> appliquée à deux machines de câblage : la Komax Alpha 433 H et la Gamma 333 PC. L'idée : instrumenter ces machines avec des capteurs, remonter les données via une Raspberry Pi, entraîner un modèle qui anticipe les pannes, puis restituer les alertes sur une interface web et mobile. Je vous propose maintenant le plan de la présentation.</w:t>
+        <w:t xml:space="preserve"> appliquée à 2 machines de câblage : la Komax Alpha 433 H et la Gamma 333 PC. L'idée : instrumenter ces machines avec des capteurs, remonter les données via une Raspberry Pi, entraîner un modèle qui anticipe les pannes, puis restituer les alertes sur une interface web et mobile. Je vous propose maintenant le plan de la présentation.</w:t>
       </w:r>
     </w:p>
     <w:p>
@@ -324,7 +324,7 @@
           <w:color w:val="000000"/>
           <w:sz w:val="23"/>
         </w:rPr>
-        <w:t>La présentation s'articule en six sections. D'abord l'introduction et le contexte industriel chez ICEM. Ensuite l'état de l'art — méthodologie, matériel, briques logicielles. Puis la conception : architecture cinq couches et modélisation UML. Le développement occupe la partie la plus dense — backend, intelligence artificielle, web, mobile, déploiement. Une courte démonstration live suivra. Et nous conclurons sur les résultats mesurés et les perspectives.</w:t>
+        <w:t>La présentation s'articule en 6 sections. D'abord l'introduction et le contexte industriel chez ICEM. Ensuite l'état de l'art — méthodologie, matériel, briques logicielles. Puis la conception : architecture 5 couches et modélisation UML. Le développement occupe la partie la plus dense — backend, intelligence artificielle, web, mobile, déploiement. Une courte démonstration live suivra. Et nous conclurons sur les résultats mesurés et les perspectives.</w:t>
       </w:r>
     </w:p>
     <w:p>
@@ -410,7 +410,7 @@
           <w:color w:val="000000"/>
           <w:sz w:val="23"/>
         </w:rPr>
-        <w:t>ICEM est une filiale du groupe Coficab, spécialisée dans la production de faisceaux électriques pour l'industrie automobile. L'usine de Nabeul emploie plusieurs centaines de personnes et produit chaque jour des milliers de sous-ensembles câblés. Le parc machine repose principalement sur des équipements Komax, qui coupent, dénudent et sertissent le fil à grande cadence. Toute panne sur ces machines interrompt une ligne entière et impacte directement le rendement. C'est dans cet environnement que le besoin de maintenance prédictive a émergé.</w:t>
+        <w:t>ICEM est une filiale du groupe Coficab, spécialisée dans la production de faisceaux électriques pour l'industrie automobile. L'usine de Nabeul emploie plusieurs centaines de personnes et produit chaque jour des milliers de sous-ensembles câblés. Le parc machine repose principalement sur des équipements Komax, qui coupent, dénudent et sertissent le fil à grande cadence. Toute panne sur ces machines interrompt une ligne entière et impacte directement le rendement. C'est dans cet environnement que le besoin de maintenance prédictive a émergé. 2 machines concentrent ce besoin.</w:t>
       </w:r>
     </w:p>
     <w:p>
@@ -453,7 +453,7 @@
           <w:color w:val="000000"/>
           <w:sz w:val="23"/>
         </w:rPr>
-        <w:t xml:space="preserve">Deux machines sont ciblées par le projet. </w:t>
+        <w:t xml:space="preserve">2 machines sont ciblées par le projet. </w:t>
       </w:r>
       <w:r>
         <w:rPr>
@@ -468,7 +468,7 @@
           <w:color w:val="000000"/>
           <w:sz w:val="23"/>
         </w:rPr>
-        <w:t xml:space="preserve"> — une machine d'entrée de gamme, quatre postes, cadence moyenne, six moteurs pas-à-pas et un cycle en sept étapes : dévidage, mesure, coupe, dénudage, transfert, sertissage, éjection. </w:t>
+        <w:t xml:space="preserve"> — une machine d'entrée de gamme, 4 postes, cadence moyenne, 6 moteurs pas-à-pas et un cycle en 7 étapes : dévidage, mesure, coupe, dénudage, transfert, sertissage, éjection. </w:t>
       </w:r>
       <w:r>
         <w:rPr>
@@ -483,7 +483,7 @@
           <w:color w:val="000000"/>
           <w:sz w:val="23"/>
         </w:rPr>
-        <w:t>, plus haut de gamme — automate compact, unité de sertissage double, entraînement par courroies crantées à tension calibrée. Sur les deux machines, on retrouve les mêmes zones critiques : la tête de coupe, les courroies, les capteurs de position et l'armoire électrique. Une analyse historique de mille cent soixante pannes ICEM nous a permis de hiérarchiser ces zones.</w:t>
+        <w:t>, plus haut de gamme — automate compact, unité de sertissage double, entraînement par courroies crantées à tension calibrée. Sur les 2 machines, on retrouve les mêmes zones critiques : la tête de coupe, les courroies, les capteurs de position et l'armoire électrique. Une analyse historique de 1 467 interventions ICEM sur 5 ans nous a permis de hiérarchiser ces zones. Reste à comprendre pourquoi la maintenance actuelle ne suffit pas.</w:t>
       </w:r>
     </w:p>
     <w:p>
@@ -556,7 +556,7 @@
           <w:color w:val="000000"/>
           <w:sz w:val="23"/>
         </w:rPr>
-        <w:t xml:space="preserve"> — on remplace à intervalle fixe. Les deux approches présentent des limites : la corrective coûte cher en arrêt de production, la préventive systématique gaspille des pièces encore fonctionnelles. L'objectif de la maintenance prédictive est d'intervenir </w:t>
+        <w:t xml:space="preserve"> — on remplace à intervalle fixe. Les 2 approches présentent des limites : la corrective coûte cher en arrêt de production, la préventive systématique gaspille des pièces encore fonctionnelles. L'objectif de la maintenance prédictive est d'intervenir </w:t>
       </w:r>
       <w:r>
         <w:rPr>
@@ -571,7 +571,7 @@
           <w:color w:val="000000"/>
           <w:sz w:val="23"/>
         </w:rPr>
-        <w:t>, à partir de signaux mesurés en continu. Sans instrumentation, cet objectif est hors d'atteinte. Le projet vise justement à fournir cette instrumentation, la chaîne de traitement associée et les interfaces métier.</w:t>
+        <w:t>, à partir de signaux mesurés en continu. Sans instrumentation, cet objectif est hors d'atteinte. Le projet vise justement à fournir cette instrumentation, la chaîne de traitement associée et les interfaces métier. De ce constat naissent 3 objectifs mesurables.</w:t>
       </w:r>
     </w:p>
     <w:p>
@@ -614,7 +614,7 @@
           <w:color w:val="000000"/>
           <w:sz w:val="23"/>
         </w:rPr>
-        <w:t>Trois objectifs mesurables ont été fixés. Premier : instrumenter les deux machines avec quatre familles de capteurs — température, vibration, thermique matricielle, courant. Deuxième : construire une chaîne complète de la donnée, du capteur jusqu'à la notification opérateur, en passant par le backend et le microservice d'intelligence artificielle. Troisième : livrer deux interfaces — une application web pour les responsables de maintenance, une application mobile pour les techniciens sur le terrain. Un microservice de fiabilité complète l'ensemble pour l'aide à la décision d'investissement.</w:t>
+        <w:t>Trois objectifs mesurables ont été fixés. Premier : instrumenter les 2 machines avec 4 familles de capteurs — température, vibration, thermique matricielle, courant. Deuxième : construire une chaîne complète de la donnée, du capteur jusqu'à la notification opérateur, en passant par le backend et le microservice d'intelligence artificielle. Troisième : livrer 2 interfaces — une application web pour les responsables de maintenance, une application mobile pour les techniciens sur le terrain. Un microservice de fiabilité complète l'ensemble pour l'aide à la décision d'investissement.</w:t>
       </w:r>
     </w:p>
     <w:p>
@@ -700,7 +700,7 @@
           <w:color w:val="000000"/>
           <w:sz w:val="23"/>
         </w:rPr>
-        <w:t xml:space="preserve">Le projet s'étale sur six mois d'avril à septembre. Nous avons adopté la méthodologie </w:t>
+        <w:t xml:space="preserve">Le projet s'étale sur 6 mois, de mars à août 2026. Nous avons adopté la méthodologie </w:t>
       </w:r>
       <w:r>
         <w:rPr>
@@ -715,7 +715,7 @@
           <w:color w:val="000000"/>
           <w:sz w:val="23"/>
         </w:rPr>
-        <w:t>, découpée en six sprints de trois à quatre semaines. Chaque sprint livre un incrément fonctionnel : sprint 1 la modélisation, sprint 2 le backend, sprint 3 l'IA, sprint 4 le web, sprint 5 le mobile, sprint 6 l'intégration IoT. Une revue en fin de sprint valide la production et alimente le backlog du sprint suivant. Cette itération courte a permis de réagir aux découvertes terrain — notamment sur le choix des capteurs.</w:t>
+        <w:t>, découpée en 6 sprints organisés par cas d'utilisation. Sprint 1 : authentification et gestion des comptes. Sprint 2 : gestion des machines et consultation du parc. Sprint 3 : maintenance et interventions. Sprint 4 : surveillance temps réel et collecte des données capteurs — c'est ce sprint qui a livré la couche capteurs que nous détaillons dans les prochaines slides. Sprint 5 : analyse des pannes, alertes et notifications. Sprint 6 : analyse de fiabilité et recommandation. Chaque sprint est validé par une revue avec l'encadreur et alimente le backlog du sprint suivant. Nous ouvrons donc directement sur le sprint 4 — les 4 types de capteurs choisis, un par un.</w:t>
       </w:r>
     </w:p>
     <w:p>
@@ -741,7 +741,7 @@
           <w:color w:val="1F4E79"/>
           <w:sz w:val="36"/>
         </w:rPr>
-        <w:t>10 — Capteurs et instrumentation (55 s)</w:t>
+        <w:t>10 — DHT22 · caractéristiques (40 s)</w:t>
       </w:r>
     </w:p>
     <w:p>
@@ -758,7 +758,7 @@
           <w:color w:val="000000"/>
           <w:sz w:val="23"/>
         </w:rPr>
-        <w:t xml:space="preserve">Quatre familles de capteurs équipent chaque machine. Le </w:t>
+        <w:t xml:space="preserve">Le premier capteur est le </w:t>
       </w:r>
       <w:r>
         <w:rPr>
@@ -766,14 +766,102 @@
           <w:color w:val="000000"/>
           <w:sz w:val="23"/>
         </w:rPr>
-        <w:t>DS18B20</w:t>
+        <w:t>DHT22</w:t>
       </w:r>
       <w:r>
         <w:rPr>
           <w:color w:val="000000"/>
           <w:sz w:val="23"/>
         </w:rPr>
-        <w:t xml:space="preserve"> — température numérique, précision d'un demi-degré — placé au contact du moteur M6 sur la Alpha et du moteur E117 sur la Gamma pour surveiller l'échauffement de roulement. Le </w:t>
+        <w:t xml:space="preserve">, une sonde numérique de température à contact. Ses caractéristiques : plage de mesure de </w:t>
+      </w:r>
+      <w:r>
+        <w:rPr>
+          <w:b/>
+          <w:color w:val="000000"/>
+          <w:sz w:val="23"/>
+        </w:rPr>
+        <w:t>-40 à +80 degrés</w:t>
+      </w:r>
+      <w:r>
+        <w:rPr>
+          <w:color w:val="000000"/>
+          <w:sz w:val="23"/>
+        </w:rPr>
+        <w:t xml:space="preserve">, précision de plus ou moins un </w:t>
+      </w:r>
+      <w:r>
+        <w:rPr>
+          <w:b/>
+          <w:color w:val="000000"/>
+          <w:sz w:val="23"/>
+        </w:rPr>
+        <w:t>demi-degré</w:t>
+      </w:r>
+      <w:r>
+        <w:rPr>
+          <w:color w:val="000000"/>
+          <w:sz w:val="23"/>
+        </w:rPr>
+        <w:t xml:space="preserve">, sortie numérique sur un seul fil de données (single-wire, distinct du bus 1-Wire), sans conversion analogique. Il fournit également l'humidité relative en bonus. Son coût unitaire tourne autour de </w:t>
+      </w:r>
+      <w:r>
+        <w:rPr>
+          <w:b/>
+          <w:color w:val="000000"/>
+          <w:sz w:val="23"/>
+        </w:rPr>
+        <w:t>3 euros</w:t>
+      </w:r>
+      <w:r>
+        <w:rPr>
+          <w:color w:val="000000"/>
+          <w:sz w:val="23"/>
+        </w:rPr>
+        <w:t>. Pourquoi ce choix ? Le moteur électrique chauffe systématiquement avant de tomber en panne — c'est le premier symptôme d'un roulement fatigué ou d'un bobinage en souffrance. Le DHT22 capte ce signal très tôt, avec une intégration triviale et une robustesse éprouvée.</w:t>
+      </w:r>
+    </w:p>
+    <w:p>
+      <w:pPr>
+        <w:spacing w:before="40" w:after="120"/>
+        <w:pBdr>
+          <w:bottom w:val="single" w:sz="6" w:color="B0B0B0" w:space="1"/>
+        </w:pBdr>
+      </w:pPr>
+    </w:p>
+    <w:p>
+      <w:pPr>
+        <w:pStyle w:val="Heading1"/>
+        <w:keepNext/>
+        <w:spacing w:before="400" w:after="160"/>
+        <w:pBdr>
+          <w:bottom w:val="single" w:sz="12" w:color="1F4E79" w:space="2"/>
+        </w:pBdr>
+      </w:pPr>
+      <w:r>
+        <w:rPr>
+          <w:b/>
+          <w:color w:val="1F4E79"/>
+          <w:sz w:val="36"/>
+        </w:rPr>
+        <w:t>11 — MPU-6050 · caractéristiques (40 s)</w:t>
+      </w:r>
+    </w:p>
+    <w:p>
+      <w:pPr>
+        <w:spacing w:before="120" w:after="160" w:line="312" w:lineRule="auto"/>
+        <w:ind w:left="170" w:right="170"/>
+        <w:pBdr>
+          <w:left w:val="single" w:sz="28" w:space="10" w:color="FF7A1A"/>
+        </w:pBdr>
+        <w:shd w:val="clear" w:color="auto" w:fill="FFF3E6"/>
+      </w:pPr>
+      <w:r>
+        <w:rPr>
+          <w:color w:val="000000"/>
+          <w:sz w:val="23"/>
+        </w:rPr>
+        <w:t xml:space="preserve">Le deuxième capteur est le </w:t>
       </w:r>
       <w:r>
         <w:rPr>
@@ -788,7 +876,7 @@
           <w:color w:val="000000"/>
           <w:sz w:val="23"/>
         </w:rPr>
-        <w:t xml:space="preserve"> — accéléromètre trois axes plus gyroscope — fixé sur le châssis près de la tête de coupe pour détecter l'usure des courroies et le désalignement lame. La </w:t>
+        <w:t xml:space="preserve">, un accéléromètre 3 axes couplé à un gyroscope 3 axes. Sa plage de mesure est réglable de plus ou moins </w:t>
       </w:r>
       <w:r>
         <w:rPr>
@@ -796,14 +884,57 @@
           <w:color w:val="000000"/>
           <w:sz w:val="23"/>
         </w:rPr>
-        <w:t>caméra thermique AMG8833</w:t>
+        <w:t>2 g à 16 g</w:t>
       </w:r>
       <w:r>
         <w:rPr>
           <w:color w:val="000000"/>
           <w:sz w:val="23"/>
         </w:rPr>
-        <w:t xml:space="preserve"> — matrice huit sur huit, champ soixante degrés — installée au-dessus de la machine pour cartographier les points chauds, en particulier le Gommino de la Gamma. Enfin la </w:t>
+        <w:t>, avec une fréquence d'échantillonnage pouvant atteindre un kilohertz. Il communique par bus I²C, sous alimentation 3 à 5 volts. Pourquoi ce composant ? C'est un standard très documenté, avec un excellent rapport qualité-prix — environ 4 euros. Les 3 axes fournissent une signature vibratoire riche, exploitable pour distinguer 2 causes physiques distinctes : une courroie détendue produit un pic basse fréquence, tandis qu'un roulement usé donne une signature harmonique haute fréquence.</w:t>
+      </w:r>
+    </w:p>
+    <w:p>
+      <w:pPr>
+        <w:spacing w:before="40" w:after="120"/>
+        <w:pBdr>
+          <w:bottom w:val="single" w:sz="6" w:color="B0B0B0" w:space="1"/>
+        </w:pBdr>
+      </w:pPr>
+    </w:p>
+    <w:p>
+      <w:pPr>
+        <w:pStyle w:val="Heading1"/>
+        <w:keepNext/>
+        <w:spacing w:before="400" w:after="160"/>
+        <w:pBdr>
+          <w:bottom w:val="single" w:sz="12" w:color="1F4E79" w:space="2"/>
+        </w:pBdr>
+      </w:pPr>
+      <w:r>
+        <w:rPr>
+          <w:b/>
+          <w:color w:val="1F4E79"/>
+          <w:sz w:val="36"/>
+        </w:rPr>
+        <w:t>12 — AMG8833 · caractéristiques (45 s)</w:t>
+      </w:r>
+    </w:p>
+    <w:p>
+      <w:pPr>
+        <w:spacing w:before="120" w:after="160" w:line="312" w:lineRule="auto"/>
+        <w:ind w:left="170" w:right="170"/>
+        <w:pBdr>
+          <w:left w:val="single" w:sz="28" w:space="10" w:color="FF7A1A"/>
+        </w:pBdr>
+        <w:shd w:val="clear" w:color="auto" w:fill="FFF3E6"/>
+      </w:pPr>
+      <w:r>
+        <w:rPr>
+          <w:color w:val="000000"/>
+          <w:sz w:val="23"/>
+        </w:rPr>
+        <w:t>Le troisième capteur est l'</w:t>
       </w:r>
       <w:r>
         <w:rPr>
@@ -811,14 +942,74 @@
           <w:color w:val="000000"/>
           <w:sz w:val="23"/>
         </w:rPr>
-        <w:t>pince SCT-013</w:t>
+        <w:t>AMG8833</w:t>
       </w:r>
       <w:r>
         <w:rPr>
           <w:color w:val="000000"/>
           <w:sz w:val="23"/>
         </w:rPr>
-        <w:t xml:space="preserve"> — soixante ampères sortie tension — clampée sur l'alimentation principale de l'armoire, connectée via un convertisseur ADS1015 douze bits. Cette combinaison couvre les zones de panne les plus coûteuses identifiées dans l'historique ICEM.</w:t>
+        <w:t xml:space="preserve">, une caméra thermique matricielle sans contact. Elle produit une image de chaleur en </w:t>
+      </w:r>
+      <w:r>
+        <w:rPr>
+          <w:b/>
+          <w:color w:val="000000"/>
+          <w:sz w:val="23"/>
+        </w:rPr>
+        <w:t>8 par 8 pixels</w:t>
+      </w:r>
+      <w:r>
+        <w:rPr>
+          <w:color w:val="000000"/>
+          <w:sz w:val="23"/>
+        </w:rPr>
+        <w:t xml:space="preserve"> — soit 64 points de mesure — sur une plage de </w:t>
+      </w:r>
+      <w:r>
+        <w:rPr>
+          <w:b/>
+          <w:color w:val="000000"/>
+          <w:sz w:val="23"/>
+        </w:rPr>
+        <w:t>-20 à +80 degrés</w:t>
+      </w:r>
+      <w:r>
+        <w:rPr>
+          <w:color w:val="000000"/>
+          <w:sz w:val="23"/>
+        </w:rPr>
+        <w:t xml:space="preserve">, avec un champ de vue de </w:t>
+      </w:r>
+      <w:r>
+        <w:rPr>
+          <w:b/>
+          <w:color w:val="000000"/>
+          <w:sz w:val="23"/>
+        </w:rPr>
+        <w:t>60 degrés par 60 degrés</w:t>
+      </w:r>
+      <w:r>
+        <w:rPr>
+          <w:color w:val="000000"/>
+          <w:sz w:val="23"/>
+        </w:rPr>
+        <w:t xml:space="preserve"> et un rafraîchissement de 10 hertz. Elle communique par I²C. Pourquoi ce capteur ? 2 raisons : d'abord une vision globale de la zone chaude sans aucun contact mécanique avec les organes en mouvement ; ensuite, sa faible résolution reste largement suffisante pour cartographier les points chauds. C'est une alternative très accessible aux caméras thermiques industrielles type FLIR, dont le prix dépasse aisément 500 euros — l'AMG8833 coûte environ </w:t>
+      </w:r>
+      <w:r>
+        <w:rPr>
+          <w:b/>
+          <w:color w:val="000000"/>
+          <w:sz w:val="23"/>
+        </w:rPr>
+        <w:t>30 euros</w:t>
+      </w:r>
+      <w:r>
+        <w:rPr>
+          <w:color w:val="000000"/>
+          <w:sz w:val="23"/>
+        </w:rPr>
+        <w:t>.</w:t>
       </w:r>
     </w:p>
     <w:p>
@@ -844,7 +1035,7 @@
           <w:color w:val="1F4E79"/>
           <w:sz w:val="36"/>
         </w:rPr>
-        <w:t>11 — Stack technique (35 s)</w:t>
+        <w:t>13 — SCT-013 · caractéristiques (45 s)</w:t>
       </w:r>
     </w:p>
     <w:p>
@@ -861,7 +1052,125 @@
           <w:color w:val="000000"/>
           <w:sz w:val="23"/>
         </w:rPr>
-        <w:t xml:space="preserve">Trois briques logicielles principales. Côté </w:t>
+        <w:t xml:space="preserve">Le quatrième capteur est la </w:t>
+      </w:r>
+      <w:r>
+        <w:rPr>
+          <w:b/>
+          <w:color w:val="000000"/>
+          <w:sz w:val="23"/>
+        </w:rPr>
+        <w:t>pince ampèremétrique SCT-013</w:t>
+      </w:r>
+      <w:r>
+        <w:rPr>
+          <w:color w:val="000000"/>
+          <w:sz w:val="23"/>
+        </w:rPr>
+        <w:t xml:space="preserve">, dans sa variante </w:t>
+      </w:r>
+      <w:r>
+        <w:rPr>
+          <w:b/>
+          <w:color w:val="000000"/>
+          <w:sz w:val="23"/>
+        </w:rPr>
+        <w:t>SCT-013-000</w:t>
+      </w:r>
+      <w:r>
+        <w:rPr>
+          <w:color w:val="000000"/>
+          <w:sz w:val="23"/>
+        </w:rPr>
+        <w:t xml:space="preserve">. Ses caractéristiques : plage 0 à 100 ampères alternatif, sortie en courant de 0 à 50 milliampères convertie en tension par une résistance de charge de 33 ohms, précision de plus ou moins </w:t>
+      </w:r>
+      <w:r>
+        <w:rPr>
+          <w:b/>
+          <w:color w:val="000000"/>
+          <w:sz w:val="23"/>
+        </w:rPr>
+        <w:t>1 %</w:t>
+      </w:r>
+      <w:r>
+        <w:rPr>
+          <w:color w:val="000000"/>
+          <w:sz w:val="23"/>
+        </w:rPr>
+        <w:t xml:space="preserve">, et lecture aux fréquences secteur 50 ou 60 hertz. Le signal analogique est numérisé par un convertisseur externe </w:t>
+      </w:r>
+      <w:r>
+        <w:rPr>
+          <w:b/>
+          <w:color w:val="000000"/>
+          <w:sz w:val="23"/>
+        </w:rPr>
+        <w:t>ADS1015 12 bits</w:t>
+      </w:r>
+      <w:r>
+        <w:rPr>
+          <w:color w:val="000000"/>
+          <w:sz w:val="23"/>
+        </w:rPr>
+        <w:t xml:space="preserve">, connecté au Raspberry Pi par I²C. Pourquoi ce choix ? La pince est </w:t>
+      </w:r>
+      <w:r>
+        <w:rPr>
+          <w:b/>
+          <w:color w:val="000000"/>
+          <w:sz w:val="23"/>
+        </w:rPr>
+        <w:t>non-invasive</w:t>
+      </w:r>
+      <w:r>
+        <w:rPr>
+          <w:color w:val="000000"/>
+          <w:sz w:val="23"/>
+        </w:rPr>
+        <w:t xml:space="preserve"> — on la clippe simplement autour du câble, sans le couper. Or le courant total de l'armoire reflète l'état mécanique agrégé de tous les moteurs : une surintensité soudaine signale une contrainte cachée, un moteur qui force ou un début de blocage. Ces 4 types de capteurs s'appuient sur une pile logicielle en 3 couches.</w:t>
+      </w:r>
+    </w:p>
+    <w:p>
+      <w:pPr>
+        <w:spacing w:before="40" w:after="120"/>
+        <w:pBdr>
+          <w:bottom w:val="single" w:sz="6" w:color="B0B0B0" w:space="1"/>
+        </w:pBdr>
+      </w:pPr>
+    </w:p>
+    <w:p>
+      <w:pPr>
+        <w:pStyle w:val="Heading1"/>
+        <w:keepNext/>
+        <w:spacing w:before="400" w:after="160"/>
+        <w:pBdr>
+          <w:bottom w:val="single" w:sz="12" w:color="1F4E79" w:space="2"/>
+        </w:pBdr>
+      </w:pPr>
+      <w:r>
+        <w:rPr>
+          <w:b/>
+          <w:color w:val="1F4E79"/>
+          <w:sz w:val="36"/>
+        </w:rPr>
+        <w:t>14 — Stack technique (35 s)</w:t>
+      </w:r>
+    </w:p>
+    <w:p>
+      <w:pPr>
+        <w:spacing w:before="120" w:after="160" w:line="312" w:lineRule="auto"/>
+        <w:ind w:left="170" w:right="170"/>
+        <w:pBdr>
+          <w:left w:val="single" w:sz="28" w:space="10" w:color="FF7A1A"/>
+        </w:pBdr>
+        <w:shd w:val="clear" w:color="auto" w:fill="FFF3E6"/>
+      </w:pPr>
+      <w:r>
+        <w:rPr>
+          <w:color w:val="000000"/>
+          <w:sz w:val="23"/>
+        </w:rPr>
+        <w:t xml:space="preserve">3 briques logicielles principales. Côté </w:t>
       </w:r>
       <w:r>
         <w:rPr>
@@ -906,7 +1215,7 @@
           <w:color w:val="000000"/>
           <w:sz w:val="23"/>
         </w:rPr>
-        <w:t xml:space="preserve"> : React.js pour l'interface web des responsables, Flutter pour l'application mobile des techniciens, et Firebase Cloud Messaging pour les notifications push. Cette pile est déployée en production sur Render pour le backend et l'IA.</w:t>
+        <w:t xml:space="preserve"> : React.js pour l'interface web des responsables, Flutter pour l'application mobile des techniciens, et Firebase Cloud Messaging pour les notifications push. L'ensemble est déployé sur le serveur interne d'ICEM, sans exposition cloud. Voyons comment ces briques s'articulent dans une architecture cohérente.</w:t>
       </w:r>
     </w:p>
     <w:p>
@@ -932,7 +1241,7 @@
           <w:color w:val="1F4E79"/>
           <w:sz w:val="36"/>
         </w:rPr>
-        <w:t>12 — Section 3 · Conception (5 s)</w:t>
+        <w:t>15 — Section 3 · Conception (5 s)</w:t>
       </w:r>
     </w:p>
     <w:p>
@@ -975,7 +1284,7 @@
           <w:color w:val="1F4E79"/>
           <w:sz w:val="36"/>
         </w:rPr>
-        <w:t>13 — Architecture cinq couches (50 s)</w:t>
+        <w:t>16 — Architecture 5 couches (50 s)</w:t>
       </w:r>
     </w:p>
     <w:p>
@@ -992,7 +1301,22 @@
           <w:color w:val="000000"/>
           <w:sz w:val="23"/>
         </w:rPr>
-        <w:t xml:space="preserve">L'écosystème repose sur cinq couches conceptuelles empilées. </w:t>
+        <w:t xml:space="preserve">Notre architecture repose sur </w:t>
+      </w:r>
+      <w:r>
+        <w:rPr>
+          <w:b/>
+          <w:color w:val="000000"/>
+          <w:sz w:val="23"/>
+        </w:rPr>
+        <w:t>5 couches</w:t>
+      </w:r>
+      <w:r>
+        <w:rPr>
+          <w:color w:val="000000"/>
+          <w:sz w:val="23"/>
+        </w:rPr>
+        <w:t xml:space="preserve">, empilées du terrain vers l'utilisateur. </w:t>
       </w:r>
       <w:r>
         <w:rPr>
@@ -1007,7 +1331,7 @@
           <w:color w:val="000000"/>
           <w:sz w:val="23"/>
         </w:rPr>
-        <w:t xml:space="preserve"> — les capteurs physiques et leurs signaux bruts. </w:t>
+        <w:t xml:space="preserve"> : les 5 capteurs installés sur la machine — 2 DHT22, un MPU-6050, un AMG8833 et une pince SCT-013. </w:t>
       </w:r>
       <w:r>
         <w:rPr>
@@ -1015,14 +1339,14 @@
           <w:color w:val="000000"/>
           <w:sz w:val="23"/>
         </w:rPr>
-        <w:t>Acquisition</w:t>
+        <w:t>Edge</w:t>
       </w:r>
       <w:r>
         <w:rPr>
           <w:color w:val="000000"/>
           <w:sz w:val="23"/>
         </w:rPr>
-        <w:t xml:space="preserve"> — la Raspberry Pi qui échantillonne, filtre et met en forme. </w:t>
+        <w:t xml:space="preserve"> : la Raspberry Pi 4, passerelle locale qui lit les capteurs en I²C et GPIO, prétraite les mesures et les envoie au serveur en HTTP POST JSON, toutes les 60 secondes. </w:t>
       </w:r>
       <w:r>
         <w:rPr>
@@ -1030,14 +1354,14 @@
           <w:color w:val="000000"/>
           <w:sz w:val="23"/>
         </w:rPr>
-        <w:t>Transport</w:t>
+        <w:t>Backend</w:t>
       </w:r>
       <w:r>
         <w:rPr>
           <w:color w:val="000000"/>
           <w:sz w:val="23"/>
         </w:rPr>
-        <w:t xml:space="preserve"> — le réseau HTTPS qui achemine les mesures vers le serveur central. </w:t>
+        <w:t xml:space="preserve"> : le serveur Node.js avec Express et MongoDB, qui expose l'API REST, gère l'authentification JWT et stocke toutes les données. </w:t>
       </w:r>
       <w:r>
         <w:rPr>
@@ -1045,14 +1369,14 @@
           <w:color w:val="000000"/>
           <w:sz w:val="23"/>
         </w:rPr>
-        <w:t>Traitement</w:t>
+        <w:t>Intelligence</w:t>
       </w:r>
       <w:r>
         <w:rPr>
           <w:color w:val="000000"/>
           <w:sz w:val="23"/>
         </w:rPr>
-        <w:t xml:space="preserve"> — le backend Node.js et le microservice FastAPI qui persistent, classifient et prédisent. </w:t>
+        <w:t xml:space="preserve"> : un microservice FastAPI avec 2 modules — Random Forest et XGBoost pour la maintenance prédictive, régression linéaire pour la fiabilité — appelés par le backend en REST. </w:t>
       </w:r>
       <w:r>
         <w:rPr>
@@ -1067,7 +1391,7 @@
           <w:color w:val="000000"/>
           <w:sz w:val="23"/>
         </w:rPr>
-        <w:t xml:space="preserve"> — les interfaces web et mobile qui restituent l'information au bon acteur. Ce découpage isole les responsabilités et facilite la maintenance future : on peut remplacer un capteur, changer d'orchestrateur ou faire évoluer l'IA sans impacter les autres couches.</w:t>
+        <w:t xml:space="preserve"> : l'interface web React et l'application mobile Flutter, qui reçoivent les alertes en push. Chaque couche a un rôle précis : on peut remplacer un capteur ou ré-entraîner un modèle sans toucher aux autres couches. Zoomons d'abord sur la couche Edge — la Raspberry Pi.</w:t>
       </w:r>
     </w:p>
     <w:p>
@@ -1093,7 +1417,7 @@
           <w:color w:val="1F4E79"/>
           <w:sz w:val="36"/>
         </w:rPr>
-        <w:t>14 — Passerelle Edge (Raspberry Pi) (40 s)</w:t>
+        <w:t>17 — Passerelle Edge (Raspberry Pi) (40 s)</w:t>
       </w:r>
     </w:p>
     <w:p>
@@ -1110,7 +1434,22 @@
           <w:color w:val="000000"/>
           <w:sz w:val="23"/>
         </w:rPr>
-        <w:t>La Raspberry Pi joue le rôle de passerelle terrain. Elle centralise les quatre capteurs via un bus I2C partagé — MPU-6050, AMG8833, ADS1015 — et un fil dédié pour le DS18B20 en OneWire. Un script Python cadencé lit chaque capteur, calcule les indicateurs (RMS courant, delta température, magnitude vibration) et envoie une trame JSON toutes les cinq secondes vers l'API. Un service systemd assure le redémarrage automatique. En cas de coupure réseau, les mesures sont mises en cache localement puis rejouées à la reconnexion.</w:t>
+        <w:t xml:space="preserve">La Raspberry Pi joue le rôle de passerelle terrain. Elle centralise les </w:t>
+      </w:r>
+      <w:r>
+        <w:rPr>
+          <w:b/>
+          <w:color w:val="000000"/>
+          <w:sz w:val="23"/>
+        </w:rPr>
+        <w:t>5 capteurs</w:t>
+      </w:r>
+      <w:r>
+        <w:rPr>
+          <w:color w:val="000000"/>
+          <w:sz w:val="23"/>
+        </w:rPr>
+        <w:t xml:space="preserve"> : le MPU-6050, l'AMG8833 et le convertisseur ADS1015 de la pince SCT-013 partagent le même bus I2C, et les 2 DHT22 utilisent chacun une broche GPIO dédiée. Un script Python lit les capteurs toutes les 60 secondes, calcule les indicateurs utiles — par exemple la valeur efficace du courant — et envoie chaque mesure en JSON par HTTP POST vers l'API, avec une clé d'authentification IoT. Si un envoi échoue, le script réessaie automatiquement avec un délai croissant. Un service systemd relance le script au démarrage ou en cas d'arrêt. Voyons maintenant où chacun de ces capteurs prend physiquement place sur la machine.</w:t>
       </w:r>
     </w:p>
     <w:p>
@@ -1136,7 +1475,7 @@
           <w:color w:val="1F4E79"/>
           <w:sz w:val="36"/>
         </w:rPr>
-        <w:t>15 — Modélisation UML (45 s)</w:t>
+        <w:t>18 — DHT22 · emplacement (35 s)</w:t>
       </w:r>
     </w:p>
     <w:p>
@@ -1153,7 +1492,329 @@
           <w:color w:val="000000"/>
           <w:sz w:val="23"/>
         </w:rPr>
-        <w:t xml:space="preserve">Deux diagrammes structurent la modélisation. Le </w:t>
+        <w:t xml:space="preserve">Voici où le </w:t>
+      </w:r>
+      <w:r>
+        <w:rPr>
+          <w:b/>
+          <w:color w:val="000000"/>
+          <w:sz w:val="23"/>
+        </w:rPr>
+        <w:t>DHT22</w:t>
+      </w:r>
+      <w:r>
+        <w:rPr>
+          <w:color w:val="000000"/>
+          <w:sz w:val="23"/>
+        </w:rPr>
+        <w:t xml:space="preserve"> est installé sur la machine. On le voit ici, fixé sur le corps du </w:t>
+      </w:r>
+      <w:r>
+        <w:rPr>
+          <w:b/>
+          <w:color w:val="000000"/>
+          <w:sz w:val="23"/>
+        </w:rPr>
+        <w:t>servomoteur</w:t>
+      </w:r>
+      <w:r>
+        <w:rPr>
+          <w:color w:val="000000"/>
+          <w:sz w:val="23"/>
+        </w:rPr>
+        <w:t>, en contact direct avec le carter métallique. Un second DHT22 se trouve à l'intérieur de l'armoire électrique pour la température ambiante. Pourquoi cette position ? Parce que le moteur chauffe avant tout autre composant en cas de problème mécanique — roulement fatigué, sur-effort, défaut de lubrification. Un contact direct donne une lecture rapide, non atténuée par l'air, ce qui maximise la sensibilité aux dérives précoces.</w:t>
+      </w:r>
+    </w:p>
+    <w:p>
+      <w:pPr>
+        <w:spacing w:before="40" w:after="120"/>
+        <w:pBdr>
+          <w:bottom w:val="single" w:sz="6" w:color="B0B0B0" w:space="1"/>
+        </w:pBdr>
+      </w:pPr>
+    </w:p>
+    <w:p>
+      <w:pPr>
+        <w:pStyle w:val="Heading1"/>
+        <w:keepNext/>
+        <w:spacing w:before="400" w:after="160"/>
+        <w:pBdr>
+          <w:bottom w:val="single" w:sz="12" w:color="1F4E79" w:space="2"/>
+        </w:pBdr>
+      </w:pPr>
+      <w:r>
+        <w:rPr>
+          <w:b/>
+          <w:color w:val="1F4E79"/>
+          <w:sz w:val="36"/>
+        </w:rPr>
+        <w:t>19 — MPU-6050 · emplacement (35 s)</w:t>
+      </w:r>
+    </w:p>
+    <w:p>
+      <w:pPr>
+        <w:spacing w:before="120" w:after="160" w:line="312" w:lineRule="auto"/>
+        <w:ind w:left="170" w:right="170"/>
+        <w:pBdr>
+          <w:left w:val="single" w:sz="28" w:space="10" w:color="FF7A1A"/>
+        </w:pBdr>
+        <w:shd w:val="clear" w:color="auto" w:fill="FFF3E6"/>
+      </w:pPr>
+      <w:r>
+        <w:rPr>
+          <w:color w:val="000000"/>
+          <w:sz w:val="23"/>
+        </w:rPr>
+        <w:t xml:space="preserve">Voici où le </w:t>
+      </w:r>
+      <w:r>
+        <w:rPr>
+          <w:b/>
+          <w:color w:val="000000"/>
+          <w:sz w:val="23"/>
+        </w:rPr>
+        <w:t>MPU-6050</w:t>
+      </w:r>
+      <w:r>
+        <w:rPr>
+          <w:color w:val="000000"/>
+          <w:sz w:val="23"/>
+        </w:rPr>
+        <w:t xml:space="preserve"> est installé. On le voit ici, collé directement sur le carter métallique à proximité immédiate de la </w:t>
+      </w:r>
+      <w:r>
+        <w:rPr>
+          <w:b/>
+          <w:color w:val="000000"/>
+          <w:sz w:val="23"/>
+        </w:rPr>
+        <w:t>tête de coupe</w:t>
+      </w:r>
+      <w:r>
+        <w:rPr>
+          <w:color w:val="000000"/>
+          <w:sz w:val="23"/>
+        </w:rPr>
+        <w:t xml:space="preserve"> — la pièce la plus sollicitée mécaniquement. Pourquoi ce placement au contact ? Parce que le signal de vibration s'atténue extrêmement vite dans l'air, dans une gaine ou dans un support flexible. Un contact rigide sur la pièce vibrante fournit un signal propre, non atténué, riche en harmoniques — indispensable pour distinguer les signatures d'usure des différents éléments mécaniques.</w:t>
+      </w:r>
+    </w:p>
+    <w:p>
+      <w:pPr>
+        <w:spacing w:before="40" w:after="120"/>
+        <w:pBdr>
+          <w:bottom w:val="single" w:sz="6" w:color="B0B0B0" w:space="1"/>
+        </w:pBdr>
+      </w:pPr>
+    </w:p>
+    <w:p>
+      <w:pPr>
+        <w:pStyle w:val="Heading1"/>
+        <w:keepNext/>
+        <w:spacing w:before="400" w:after="160"/>
+        <w:pBdr>
+          <w:bottom w:val="single" w:sz="12" w:color="1F4E79" w:space="2"/>
+        </w:pBdr>
+      </w:pPr>
+      <w:r>
+        <w:rPr>
+          <w:b/>
+          <w:color w:val="1F4E79"/>
+          <w:sz w:val="36"/>
+        </w:rPr>
+        <w:t>20 — AMG8833 · emplacement (40 s)</w:t>
+      </w:r>
+    </w:p>
+    <w:p>
+      <w:pPr>
+        <w:spacing w:before="120" w:after="160" w:line="312" w:lineRule="auto"/>
+        <w:ind w:left="170" w:right="170"/>
+        <w:pBdr>
+          <w:left w:val="single" w:sz="28" w:space="10" w:color="FF7A1A"/>
+        </w:pBdr>
+        <w:shd w:val="clear" w:color="auto" w:fill="FFF3E6"/>
+      </w:pPr>
+      <w:r>
+        <w:rPr>
+          <w:color w:val="000000"/>
+          <w:sz w:val="23"/>
+        </w:rPr>
+        <w:t>Voici où l'</w:t>
+      </w:r>
+      <w:r>
+        <w:rPr>
+          <w:b/>
+          <w:color w:val="000000"/>
+          <w:sz w:val="23"/>
+        </w:rPr>
+        <w:t>AMG8833</w:t>
+      </w:r>
+      <w:r>
+        <w:rPr>
+          <w:color w:val="000000"/>
+          <w:sz w:val="23"/>
+        </w:rPr>
+        <w:t xml:space="preserve"> est installée. On la voit ici, fixée en hauteur sur le châssis de la machine, à environ </w:t>
+      </w:r>
+      <w:r>
+        <w:rPr>
+          <w:b/>
+          <w:color w:val="000000"/>
+          <w:sz w:val="23"/>
+        </w:rPr>
+        <w:t>50 centimètres</w:t>
+      </w:r>
+      <w:r>
+        <w:rPr>
+          <w:color w:val="000000"/>
+          <w:sz w:val="23"/>
+        </w:rPr>
+        <w:t xml:space="preserve">, en vue plongeante sur la </w:t>
+      </w:r>
+      <w:r>
+        <w:rPr>
+          <w:b/>
+          <w:color w:val="000000"/>
+          <w:sz w:val="23"/>
+        </w:rPr>
+        <w:t>tête de coupe</w:t>
+      </w:r>
+      <w:r>
+        <w:rPr>
+          <w:color w:val="000000"/>
+          <w:sz w:val="23"/>
+        </w:rPr>
+        <w:t xml:space="preserve"> et la </w:t>
+      </w:r>
+      <w:r>
+        <w:rPr>
+          <w:b/>
+          <w:color w:val="000000"/>
+          <w:sz w:val="23"/>
+        </w:rPr>
+        <w:t>zone Gommino</w:t>
+      </w:r>
+      <w:r>
+        <w:rPr>
+          <w:color w:val="000000"/>
+          <w:sz w:val="23"/>
+        </w:rPr>
+        <w:t>. Pourquoi cette position ? Son champ de 60 degrés par 60 degrés couvre la totalité de la zone chaude critique, avec une résolution de l'ordre de 6 centimètres par pixel. On surveille ainsi conjointement les composants les plus exposés à l'échauffement — le Gommino et le carter de la tête de coupe — sans aucune intrusion mécanique sur les organes en mouvement.</w:t>
+      </w:r>
+    </w:p>
+    <w:p>
+      <w:pPr>
+        <w:spacing w:before="40" w:after="120"/>
+        <w:pBdr>
+          <w:bottom w:val="single" w:sz="6" w:color="B0B0B0" w:space="1"/>
+        </w:pBdr>
+      </w:pPr>
+    </w:p>
+    <w:p>
+      <w:pPr>
+        <w:pStyle w:val="Heading1"/>
+        <w:keepNext/>
+        <w:spacing w:before="400" w:after="160"/>
+        <w:pBdr>
+          <w:bottom w:val="single" w:sz="12" w:color="1F4E79" w:space="2"/>
+        </w:pBdr>
+      </w:pPr>
+      <w:r>
+        <w:rPr>
+          <w:b/>
+          <w:color w:val="1F4E79"/>
+          <w:sz w:val="36"/>
+        </w:rPr>
+        <w:t>21 — SCT-013 · emplacement (35 s)</w:t>
+      </w:r>
+    </w:p>
+    <w:p>
+      <w:pPr>
+        <w:spacing w:before="120" w:after="160" w:line="312" w:lineRule="auto"/>
+        <w:ind w:left="170" w:right="170"/>
+        <w:pBdr>
+          <w:left w:val="single" w:sz="28" w:space="10" w:color="FF7A1A"/>
+        </w:pBdr>
+        <w:shd w:val="clear" w:color="auto" w:fill="FFF3E6"/>
+      </w:pPr>
+      <w:r>
+        <w:rPr>
+          <w:color w:val="000000"/>
+          <w:sz w:val="23"/>
+        </w:rPr>
+        <w:t xml:space="preserve">Voici où la </w:t>
+      </w:r>
+      <w:r>
+        <w:rPr>
+          <w:b/>
+          <w:color w:val="000000"/>
+          <w:sz w:val="23"/>
+        </w:rPr>
+        <w:t>pince SCT-013</w:t>
+      </w:r>
+      <w:r>
+        <w:rPr>
+          <w:color w:val="000000"/>
+          <w:sz w:val="23"/>
+        </w:rPr>
+        <w:t xml:space="preserve"> est installée. On la voit ici — la pince bleue — clampée autour d'un câble à l'intérieur de l'armoire électrique. Le signal, converti en tension par une résistance de charge de 33 ohms, est ramené au Raspberry Pi, visible dans le paquet essai en bas, via le convertisseur </w:t>
+      </w:r>
+      <w:r>
+        <w:rPr>
+          <w:b/>
+          <w:color w:val="000000"/>
+          <w:sz w:val="23"/>
+        </w:rPr>
+        <w:t>ADS1015 12 bits</w:t>
+      </w:r>
+      <w:r>
+        <w:rPr>
+          <w:color w:val="000000"/>
+          <w:sz w:val="23"/>
+        </w:rPr>
+        <w:t xml:space="preserve"> posé sur la breadboard. Pourquoi cette position ? Parce que ce câble porte le courant tiré par les moteurs — une seule pince suffit à obtenir une vision agrégée de l'état électrique. Comme la mesure est non-invasive, la pose et le retrait se font sans interruption de production. La couche physique posée, passons à la modélisation logicielle du système.</w:t>
+      </w:r>
+    </w:p>
+    <w:p>
+      <w:pPr>
+        <w:spacing w:before="40" w:after="120"/>
+        <w:pBdr>
+          <w:bottom w:val="single" w:sz="6" w:color="B0B0B0" w:space="1"/>
+        </w:pBdr>
+      </w:pPr>
+    </w:p>
+    <w:p>
+      <w:pPr>
+        <w:pStyle w:val="Heading1"/>
+        <w:keepNext/>
+        <w:spacing w:before="400" w:after="160"/>
+        <w:pBdr>
+          <w:bottom w:val="single" w:sz="12" w:color="1F4E79" w:space="2"/>
+        </w:pBdr>
+      </w:pPr>
+      <w:r>
+        <w:rPr>
+          <w:b/>
+          <w:color w:val="1F4E79"/>
+          <w:sz w:val="36"/>
+        </w:rPr>
+        <w:t>22 — Diagramme de cas d'utilisation (30 s)</w:t>
+      </w:r>
+    </w:p>
+    <w:p>
+      <w:pPr>
+        <w:spacing w:before="120" w:after="160" w:line="312" w:lineRule="auto"/>
+        <w:ind w:left="170" w:right="170"/>
+        <w:pBdr>
+          <w:left w:val="single" w:sz="28" w:space="10" w:color="FF7A1A"/>
+        </w:pBdr>
+        <w:shd w:val="clear" w:color="auto" w:fill="FFF3E6"/>
+      </w:pPr>
+      <w:r>
+        <w:rPr>
+          <w:color w:val="000000"/>
+          <w:sz w:val="23"/>
+        </w:rPr>
+        <w:t xml:space="preserve">Le </w:t>
       </w:r>
       <w:r>
         <w:rPr>
@@ -1168,7 +1829,65 @@
           <w:color w:val="000000"/>
           <w:sz w:val="23"/>
         </w:rPr>
-        <w:t xml:space="preserve"> identifie six acteurs — Responsable Maintenance, Chef de Ligne, Technicien, plus trois acteurs système : IoT, IA, notification — et une quinzaine de cas fonctionnels : gestion des machines, planification préventive, interventions correctives, supervision temps réel, classification de pannes, rapports de fiabilité. Le </w:t>
+        <w:t xml:space="preserve"> identifie 6 acteurs : 3 acteurs humains — Responsable Maintenance, Chef de Ligne, Technicien — et 3 acteurs système — le Système IA Maintenance, le Système IA Analyse de fiabilité et l'IoT. Ils interviennent sur </w:t>
+      </w:r>
+      <w:r>
+        <w:rPr>
+          <w:b/>
+          <w:color w:val="000000"/>
+          <w:sz w:val="23"/>
+        </w:rPr>
+        <w:t>12 cas d'utilisation</w:t>
+      </w:r>
+      <w:r>
+        <w:rPr>
+          <w:color w:val="000000"/>
+          <w:sz w:val="23"/>
+        </w:rPr>
+        <w:t>. Le responsable gère les machines, les comptes utilisateurs et la maintenance. Le chef de ligne surveille l'état des machines et supervise les alertes. Le technicien reçoit les notifications d'alerte et gère les interventions. Côté système, l'IA analyse les pannes et suggère les causes, l'analyse de fiabilité recommande le maintien ou le renouvellement d'une machine, et l'IoT collecte les données capteurs. Toutes les actions humaines passent par l'authentification. Ces cas d'utilisation s'appuient sur 9 classes.</w:t>
+      </w:r>
+    </w:p>
+    <w:p>
+      <w:pPr>
+        <w:spacing w:before="40" w:after="120"/>
+        <w:pBdr>
+          <w:bottom w:val="single" w:sz="6" w:color="B0B0B0" w:space="1"/>
+        </w:pBdr>
+      </w:pPr>
+    </w:p>
+    <w:p>
+      <w:pPr>
+        <w:pStyle w:val="Heading1"/>
+        <w:keepNext/>
+        <w:spacing w:before="400" w:after="160"/>
+        <w:pBdr>
+          <w:bottom w:val="single" w:sz="12" w:color="1F4E79" w:space="2"/>
+        </w:pBdr>
+      </w:pPr>
+      <w:r>
+        <w:rPr>
+          <w:b/>
+          <w:color w:val="1F4E79"/>
+          <w:sz w:val="36"/>
+        </w:rPr>
+        <w:t>23 — Diagramme de classes (30 s)</w:t>
+      </w:r>
+    </w:p>
+    <w:p>
+      <w:pPr>
+        <w:spacing w:before="120" w:after="160" w:line="312" w:lineRule="auto"/>
+        <w:ind w:left="170" w:right="170"/>
+        <w:pBdr>
+          <w:left w:val="single" w:sz="28" w:space="10" w:color="FF7A1A"/>
+        </w:pBdr>
+        <w:shd w:val="clear" w:color="auto" w:fill="FFF3E6"/>
+      </w:pPr>
+      <w:r>
+        <w:rPr>
+          <w:color w:val="000000"/>
+          <w:sz w:val="23"/>
+        </w:rPr>
+        <w:t xml:space="preserve">Le </w:t>
       </w:r>
       <w:r>
         <w:rPr>
@@ -1183,7 +1902,37 @@
           <w:color w:val="000000"/>
           <w:sz w:val="23"/>
         </w:rPr>
-        <w:t xml:space="preserve"> modélise cinq entités principales : Machine, Utilisateur, Intervention, Alerte, Capteur. La classe Maintenance porte un type énuméré qui distingue préventif, correctif et prédictif — plutôt que trois classes séparées, ce qui simplifie les requêtes.</w:t>
+        <w:t xml:space="preserve"> modélise </w:t>
+      </w:r>
+      <w:r>
+        <w:rPr>
+          <w:b/>
+          <w:color w:val="000000"/>
+          <w:sz w:val="23"/>
+        </w:rPr>
+        <w:t>9 classes</w:t>
+      </w:r>
+      <w:r>
+        <w:rPr>
+          <w:color w:val="000000"/>
+          <w:sz w:val="23"/>
+        </w:rPr>
+        <w:t xml:space="preserve">, en 3 groupes. Le cœur métier : Utilisateur, Ligne, Machine, Maintenance et Alerte. La couche IoT : Capteur et RaspberryPi. La couche IA : AnalyseIA pour le diagnostic des pannes, et AnalyseTCO pour l'analyse de fiabilité. Ces classes structurent la base MongoDB. Choix de conception marquant : une seule classe Maintenance porte un </w:t>
+      </w:r>
+      <w:r>
+        <w:rPr>
+          <w:b/>
+          <w:color w:val="000000"/>
+          <w:sz w:val="23"/>
+        </w:rPr>
+        <w:t>type énuméré</w:t>
+      </w:r>
+      <w:r>
+        <w:rPr>
+          <w:color w:val="000000"/>
+          <w:sz w:val="23"/>
+        </w:rPr>
+        <w:t xml:space="preserve"> à 5 valeurs — préventive, corrective, prédictive, checklist journalière et checklist préventive — plutôt que 5 classes séparées. Cela simplifie les requêtes et unifie le workflow d'assignation. Ces entités s'enchaînent en temps réel selon un pipeline précis.</w:t>
       </w:r>
     </w:p>
     <w:p>
@@ -1209,7 +1958,7 @@
           <w:color w:val="1F4E79"/>
           <w:sz w:val="36"/>
         </w:rPr>
-        <w:t>16 — Pipeline de données temps réel (45 s)</w:t>
+        <w:t>24 — Pipeline de données temps réel (45 s)</w:t>
       </w:r>
     </w:p>
     <w:p>
@@ -1226,7 +1975,7 @@
           <w:color w:val="000000"/>
           <w:sz w:val="23"/>
         </w:rPr>
-        <w:t>Le pipeline temps réel enchaîne cinq étapes déterministes. Un — la Raspberry Pi publie un JSON toutes les cinq secondes sur l'endpoint capteurs. Deux — le backend valide le payload, l'associe à la machine cible et le persiste dans MongoDB. Trois — un service applicatif transmet automatiquement la mesure au microservice IA. Quatre — FastAPI renvoie la probabilité de panne, le type détecté et la cause probable. Cinq — si la probabilité dépasse quatre-vingts pour cent, une maintenance prédictive est créée automatiquement et une notification est poussée vers les techniciens concernés. L'ensemble tient dans une latence inférieure à la seconde.</w:t>
+        <w:t>Le pipeline temps réel enchaîne 5 étapes, sans aucune action humaine. 1 — la Raspberry Pi lit les 5 capteurs toutes les 60 secondes et envoie un JSON sur l'endpoint d'ingestion. 2 — le backend valide la mesure, l'associe à la machine et l'enregistre dans MongoDB. 3 — à chaque ingestion, le backend appelle automatiquement le microservice IA. 4 — FastAPI renvoie la probabilité de panne, le type et la cause probable. 5 — 2 seuils décident de l'action : à partir de 60 %, une alerte d'avertissement ; à partir de 80 %, une alerte critique, une intervention prédictive en attente sous 48 heures, et une notification push au responsable maintenance. De la mesure à l'alerte, il faut moins d'une seconde — l'inférence elle-même prend moins de 35 millisecondes. Le développement de ces briques constitue la partie la plus dense du projet.</w:t>
       </w:r>
     </w:p>
     <w:p>
@@ -1252,7 +2001,7 @@
           <w:color w:val="1F4E79"/>
           <w:sz w:val="36"/>
         </w:rPr>
-        <w:t>17 — Section 4 · Développement (5 s)</w:t>
+        <w:t>25 — Section 4 · Développement (5 s)</w:t>
       </w:r>
     </w:p>
     <w:p>
@@ -1295,7 +2044,7 @@
           <w:color w:val="1F4E79"/>
           <w:sz w:val="36"/>
         </w:rPr>
-        <w:t>18 — Backend Express + MongoDB (45 s)</w:t>
+        <w:t>26 — Backend Express + MongoDB (45 s)</w:t>
       </w:r>
     </w:p>
     <w:p>
@@ -1312,7 +2061,7 @@
           <w:color w:val="000000"/>
           <w:sz w:val="23"/>
         </w:rPr>
-        <w:t xml:space="preserve">Le backend expose une API REST organisée en huit ressources principales : machines, utilisateurs, interventions, alertes, capteurs, maintenances, checklists et analyses de fiabilité. L'authentification repose sur JWT avec trois rôles : responsable, chef de ligne, technicien. Un middleware centralise le contrôle d'accès à partir d'un fichier de permissions unique — la même règle protège l'API et l'interface. Les controllers utilisent un pattern </w:t>
+        <w:t xml:space="preserve">Le backend expose une API REST avec Node.js et Express. MongoDB stocke 9 collections principales — les mêmes que le diagramme de classes : utilisateurs, lignes, machines, maintenances, alertes, capteurs, Raspberry Pi, analyses IA et analyses de fiabilité — plus les checklists et le planning. L'authentification repose sur JWT avec 3 rôles : responsable, chef de ligne, technicien. Côté API, un middleware vérifie le rôle sur chaque route. Côté interface, un fichier de permissions unique masque les pages et les boutons selon le rôle. La Raspberry Pi, elle, s'authentifie par une clé d'API dédiée. Les controllers utilisent un pattern </w:t>
       </w:r>
       <w:r>
         <w:rPr>
@@ -1327,7 +2076,7 @@
           <w:color w:val="000000"/>
           <w:sz w:val="23"/>
         </w:rPr>
-        <w:t xml:space="preserve"> pour propager proprement les erreurs. Le seed script initialise la base avec des machines, utilisateurs et checklists de démonstration.</w:t>
+        <w:t xml:space="preserve"> pour propager proprement les erreurs. Le seed script initialise la base avec des machines, utilisateurs et checklists de démonstration. Le backend appelle systématiquement le microservice IA à chaque nouvelle mesure.</w:t>
       </w:r>
     </w:p>
     <w:p>
@@ -1353,7 +2102,7 @@
           <w:color w:val="1F4E79"/>
           <w:sz w:val="36"/>
         </w:rPr>
-        <w:t>18-bis — Microservice IA FastAPI (45 s)</w:t>
+        <w:t>27 — Microservice IA FastAPI (45 s)</w:t>
       </w:r>
     </w:p>
     <w:p>
@@ -1370,7 +2119,7 @@
           <w:color w:val="000000"/>
           <w:sz w:val="23"/>
         </w:rPr>
-        <w:t>Le microservice IA est écrit en Python avec FastAPI. Il expose quatre endpoints : prédiction du type de panne, classification de la cause probable, probabilité de défaillance à horizon court, prévision de fiabilité. Deux modèles sont embarqués : un Random Forest pour la classification de causes physiques, un XGBoost pour la probabilité fine. Un troisième modèle — régression linéaire — alimente le calcul de fiabilité prévisionnelle. Le backend appelle ce microservice à chaque ingestion de mesure, sans blocage de la Raspberry Pi.</w:t>
+        <w:t>Le microservice IA est écrit en Python avec FastAPI. Il expose 5 endpoints : un test de disponibilité, et 4 endpoints de prédiction. Il embarque 4 modèles, chacun avec un rôle précis. Le Random Forest v1 classe les pannes de l'historique ICEM par zone. Le Random Forest v2 trouve en temps réel la cause probable parmi 13 causes physiques. Le XGBoost v3 estime la probabilité de panne dans les 2 heures. Enfin, une régression linéaire projette la fiabilité sur 3 mois. Les seuils pilotent l'action : à 60 %, une alerte ; à 80 %, une alerte critique et une maintenance prédictive. Le backend appelle ce microservice à chaque ingestion de mesure, sans blocage de la Raspberry Pi. Reste à savoir sur quoi ces modèles ont été entraînés.</w:t>
       </w:r>
     </w:p>
     <w:p>
@@ -1396,7 +2145,7 @@
           <w:color w:val="1F4E79"/>
           <w:sz w:val="36"/>
         </w:rPr>
-        <w:t>19 — Dataset d'entraînement (50 s)</w:t>
+        <w:t>28 — Dataset d'entraînement (35 s)</w:t>
       </w:r>
     </w:p>
     <w:p>
@@ -1413,7 +2162,93 @@
           <w:color w:val="000000"/>
           <w:sz w:val="23"/>
         </w:rPr>
-        <w:t xml:space="preserve">Faute de déploiement matériel à l'échelle, le dataset d'entraînement est </w:t>
+        <w:t>Pour entraîner l'IA, on a 2 sources. D'abord, l'historique réel : 1 467 interventions ICEM sur 5 ans. Ensuite, les capteurs ne sont pas encore en production, donc on a généré 64 800 lectures synthétiques, une toutes les 5 minutes. Chaque cause a sa signature. Une panne moteur fait monter le courant, la température et la vibration. Un encrassement crée un point chaud d'environ 5 degrés. Un paramètre logiciel ne laisse aucune trace. Découpage 80/20, stratifié. Plus tard, on ré-entraînera sur les vraies mesures.</w:t>
+      </w:r>
+    </w:p>
+    <w:p>
+      <w:pPr>
+        <w:spacing w:before="40" w:after="120"/>
+        <w:pBdr>
+          <w:bottom w:val="single" w:sz="6" w:color="B0B0B0" w:space="1"/>
+        </w:pBdr>
+      </w:pPr>
+    </w:p>
+    <w:p>
+      <w:pPr>
+        <w:pStyle w:val="Heading1"/>
+        <w:keepNext/>
+        <w:spacing w:before="400" w:after="160"/>
+        <w:pBdr>
+          <w:bottom w:val="single" w:sz="12" w:color="1F4E79" w:space="2"/>
+        </w:pBdr>
+      </w:pPr>
+      <w:r>
+        <w:rPr>
+          <w:b/>
+          <w:color w:val="1F4E79"/>
+          <w:sz w:val="36"/>
+        </w:rPr>
+        <w:t>29 — Taxonomie de causes (30 s)</w:t>
+      </w:r>
+    </w:p>
+    <w:p>
+      <w:pPr>
+        <w:spacing w:before="120" w:after="160" w:line="312" w:lineRule="auto"/>
+        <w:ind w:left="170" w:right="170"/>
+        <w:pBdr>
+          <w:left w:val="single" w:sz="28" w:space="10" w:color="FF7A1A"/>
+        </w:pBdr>
+        <w:shd w:val="clear" w:color="auto" w:fill="FFF3E6"/>
+      </w:pPr>
+      <w:r>
+        <w:rPr>
+          <w:color w:val="000000"/>
+          <w:sz w:val="23"/>
+        </w:rPr>
+        <w:t>Le modèle classe chaque panne parmi 13 causes physiques, de C01 à C13. On les regroupe en 3 familles. Signature forte : moteur, courroie, casse — les capteurs les voient bien. Signature partielle : encrassement, réglage MINI, carte électronique. Aucune signature : consommable, capteur en défaut, paramètre logiciel — aucun capteur ne peut les voir. C'est honnête : l'IA complète le diagnostic humain, elle ne le remplace pas.</w:t>
+      </w:r>
+    </w:p>
+    <w:p>
+      <w:pPr>
+        <w:spacing w:before="40" w:after="120"/>
+        <w:pBdr>
+          <w:bottom w:val="single" w:sz="6" w:color="B0B0B0" w:space="1"/>
+        </w:pBdr>
+      </w:pPr>
+    </w:p>
+    <w:p>
+      <w:pPr>
+        <w:pStyle w:val="Heading1"/>
+        <w:keepNext/>
+        <w:spacing w:before="400" w:after="160"/>
+        <w:pBdr>
+          <w:bottom w:val="single" w:sz="12" w:color="1F4E79" w:space="2"/>
+        </w:pBdr>
+      </w:pPr>
+      <w:r>
+        <w:rPr>
+          <w:b/>
+          <w:color w:val="1F4E79"/>
+          <w:sz w:val="36"/>
+        </w:rPr>
+        <w:t>30 — Performances F1 (35 s)</w:t>
+      </w:r>
+    </w:p>
+    <w:p>
+      <w:pPr>
+        <w:spacing w:before="120" w:after="160" w:line="312" w:lineRule="auto"/>
+        <w:ind w:left="170" w:right="170"/>
+        <w:pBdr>
+          <w:left w:val="single" w:sz="28" w:space="10" w:color="FF7A1A"/>
+        </w:pBdr>
+        <w:shd w:val="clear" w:color="auto" w:fill="FFF3E6"/>
+      </w:pPr>
+      <w:r>
+        <w:rPr>
+          <w:color w:val="000000"/>
+          <w:sz w:val="23"/>
+        </w:rPr>
+        <w:t xml:space="preserve">3 modèles, 3 tâches différentes : on ne compare pas leurs scores entre eux. Le </w:t>
       </w:r>
       <w:r>
         <w:rPr>
@@ -1421,14 +2256,14 @@
           <w:color w:val="000000"/>
           <w:sz w:val="23"/>
         </w:rPr>
-        <w:t>synthétique et ancré sur des signaux réels</w:t>
+        <w:t>Random Forest v1</w:t>
       </w:r>
       <w:r>
         <w:rPr>
           <w:color w:val="000000"/>
           <w:sz w:val="23"/>
         </w:rPr>
-        <w:t xml:space="preserve">. Nous avons généré soixante-quatre mille huit cents lectures à partir d'un script paramétrique, calibré sur les fiches techniques Komax, les manuels moteur et surtout </w:t>
+        <w:t xml:space="preserve">, sur l'historique par zones, reste faible : </w:t>
       </w:r>
       <w:r>
         <w:rPr>
@@ -1436,100 +2271,14 @@
           <w:color w:val="000000"/>
           <w:sz w:val="23"/>
         </w:rPr>
-        <w:t>l'historique réel de mille cent soixante pannes ICEM</w:t>
+        <w:t>0,15</w:t>
       </w:r>
       <w:r>
         <w:rPr>
           <w:color w:val="000000"/>
           <w:sz w:val="23"/>
         </w:rPr>
-        <w:t>. Chaque profil de défaut respecte la signature physique attendue — par exemple un delta température de plus quatre à huit degrés pour l'usure de roulement, une surcharge courant de six ampères sur une panne générale multi-moteurs. Ce jeu est ensuite rejouable tel quel lorsque les capteurs physiques seront installés.</w:t>
-      </w:r>
-    </w:p>
-    <w:p>
-      <w:pPr>
-        <w:spacing w:before="40" w:after="120"/>
-        <w:pBdr>
-          <w:bottom w:val="single" w:sz="6" w:color="B0B0B0" w:space="1"/>
-        </w:pBdr>
-      </w:pPr>
-    </w:p>
-    <w:p>
-      <w:pPr>
-        <w:pStyle w:val="Heading1"/>
-        <w:keepNext/>
-        <w:spacing w:before="400" w:after="160"/>
-        <w:pBdr>
-          <w:bottom w:val="single" w:sz="12" w:color="1F4E79" w:space="2"/>
-        </w:pBdr>
-      </w:pPr>
-      <w:r>
-        <w:rPr>
-          <w:b/>
-          <w:color w:val="1F4E79"/>
-          <w:sz w:val="36"/>
-        </w:rPr>
-        <w:t>20 — Taxonomie de causes (45 s)</w:t>
-      </w:r>
-    </w:p>
-    <w:p>
-      <w:pPr>
-        <w:spacing w:before="120" w:after="160" w:line="312" w:lineRule="auto"/>
-        <w:ind w:left="170" w:right="170"/>
-        <w:pBdr>
-          <w:left w:val="single" w:sz="28" w:space="10" w:color="FF7A1A"/>
-        </w:pBdr>
-        <w:shd w:val="clear" w:color="auto" w:fill="FFF3E6"/>
-      </w:pPr>
-      <w:r>
-        <w:rPr>
-          <w:color w:val="000000"/>
-          <w:sz w:val="23"/>
-        </w:rPr>
-        <w:t>La classification distingue treize causes physiques codées C01 à C13 : usure moteur, désalignement lame, courroie détendue, contamination Gommino, surintensité armoire, échauffement carte, capteur défaillant, obstruction mécanique, défaut alimentation, dérive calibration, blocage éjection, défaut communication, non-signature. Cette taxonomie remplace un premier étiquetage par zones — désormais le modèle ne duplique plus la sortie de l'interface opérateur et fournit une information réellement complémentaire au diagnostic humain.</w:t>
-      </w:r>
-    </w:p>
-    <w:p>
-      <w:pPr>
-        <w:spacing w:before="40" w:after="120"/>
-        <w:pBdr>
-          <w:bottom w:val="single" w:sz="6" w:color="B0B0B0" w:space="1"/>
-        </w:pBdr>
-      </w:pPr>
-    </w:p>
-    <w:p>
-      <w:pPr>
-        <w:pStyle w:val="Heading1"/>
-        <w:keepNext/>
-        <w:spacing w:before="400" w:after="160"/>
-        <w:pBdr>
-          <w:bottom w:val="single" w:sz="12" w:color="1F4E79" w:space="2"/>
-        </w:pBdr>
-      </w:pPr>
-      <w:r>
-        <w:rPr>
-          <w:b/>
-          <w:color w:val="1F4E79"/>
-          <w:sz w:val="36"/>
-        </w:rPr>
-        <w:t>21 — Performances F1 (50 s)</w:t>
-      </w:r>
-    </w:p>
-    <w:p>
-      <w:pPr>
-        <w:spacing w:before="120" w:after="160" w:line="312" w:lineRule="auto"/>
-        <w:ind w:left="170" w:right="170"/>
-        <w:pBdr>
-          <w:left w:val="single" w:sz="28" w:space="10" w:color="FF7A1A"/>
-        </w:pBdr>
-        <w:shd w:val="clear" w:color="auto" w:fill="FFF3E6"/>
-      </w:pPr>
-      <w:r>
-        <w:rPr>
-          <w:color w:val="000000"/>
-          <w:sz w:val="23"/>
-        </w:rPr>
-        <w:t xml:space="preserve">Deux modèles sont évalués sur le même jeu de test. Le </w:t>
+        <w:t xml:space="preserve">. Le </w:t>
       </w:r>
       <w:r>
         <w:rPr>
@@ -1537,14 +2286,14 @@
           <w:color w:val="000000"/>
           <w:sz w:val="23"/>
         </w:rPr>
-        <w:t>Random Forest</w:t>
+        <w:t>Random Forest v2</w:t>
       </w:r>
       <w:r>
         <w:rPr>
           <w:color w:val="000000"/>
           <w:sz w:val="23"/>
         </w:rPr>
-        <w:t xml:space="preserve"> — modèle de référence — atteint un F1 macro de </w:t>
+        <w:t xml:space="preserve"> classe les 13 causes plus la classe normale : F1 macro </w:t>
       </w:r>
       <w:r>
         <w:rPr>
@@ -1552,14 +2301,14 @@
           <w:color w:val="000000"/>
           <w:sz w:val="23"/>
         </w:rPr>
-        <w:t>zéro virgule quarante-cinq</w:t>
+        <w:t>0,45</w:t>
       </w:r>
       <w:r>
         <w:rPr>
           <w:color w:val="000000"/>
           <w:sz w:val="23"/>
         </w:rPr>
-        <w:t xml:space="preserve">, correct sur les classes majoritaires mais faible sur les causes rares. Le </w:t>
+        <w:t xml:space="preserve">, F1 pondéré </w:t>
       </w:r>
       <w:r>
         <w:rPr>
@@ -1567,14 +2316,14 @@
           <w:color w:val="000000"/>
           <w:sz w:val="23"/>
         </w:rPr>
-        <w:t>XGBoost</w:t>
+        <w:t>0,81</w:t>
       </w:r>
       <w:r>
         <w:rPr>
           <w:color w:val="000000"/>
           <w:sz w:val="23"/>
         </w:rPr>
-        <w:t xml:space="preserve"> — modèle final retenu — atteint un F1 macro de </w:t>
+        <w:t xml:space="preserve">. Les 3 causes sans signature capteur font baisser la moyenne. Le </w:t>
       </w:r>
       <w:r>
         <w:rPr>
@@ -1582,315 +2331,14 @@
           <w:color w:val="000000"/>
           <w:sz w:val="23"/>
         </w:rPr>
-        <w:t>zéro virgule quatre-vingt-treize</w:t>
+        <w:t>XGBoost v3</w:t>
       </w:r>
       <w:r>
         <w:rPr>
           <w:color w:val="000000"/>
           <w:sz w:val="23"/>
         </w:rPr>
-        <w:t>, avec une précision supérieure à quatre-vingt-dix pour cent sur onze des treize causes. Le gain vient du gradient boosting, plus adapté aux distributions déséquilibrées, combiné à un ré-échantillonnage SMOTE ciblé sur les classes minoritaires. Ces résultats valident l'architecture ; le modèle sera ré-entraîné sur données réelles après installation physique.</w:t>
-      </w:r>
-    </w:p>
-    <w:p>
-      <w:pPr>
-        <w:spacing w:before="40" w:after="120"/>
-        <w:pBdr>
-          <w:bottom w:val="single" w:sz="6" w:color="B0B0B0" w:space="1"/>
-        </w:pBdr>
-      </w:pPr>
-    </w:p>
-    <w:p>
-      <w:pPr>
-        <w:pStyle w:val="Heading1"/>
-        <w:keepNext/>
-        <w:spacing w:before="400" w:after="160"/>
-        <w:pBdr>
-          <w:bottom w:val="single" w:sz="12" w:color="1F4E79" w:space="2"/>
-        </w:pBdr>
-      </w:pPr>
-      <w:r>
-        <w:rPr>
-          <w:b/>
-          <w:color w:val="1F4E79"/>
-          <w:sz w:val="36"/>
-        </w:rPr>
-        <w:t>22 — Matrice de confusion (35 s)</w:t>
-      </w:r>
-    </w:p>
-    <w:p>
-      <w:pPr>
-        <w:spacing w:before="120" w:after="160" w:line="312" w:lineRule="auto"/>
-        <w:ind w:left="170" w:right="170"/>
-        <w:pBdr>
-          <w:left w:val="single" w:sz="28" w:space="10" w:color="FF7A1A"/>
-        </w:pBdr>
-        <w:shd w:val="clear" w:color="auto" w:fill="FFF3E6"/>
-      </w:pPr>
-      <w:r>
-        <w:rPr>
-          <w:color w:val="000000"/>
-          <w:sz w:val="23"/>
-        </w:rPr>
-        <w:t>La matrice de confusion du XGBoost montre une diagonale dominante — la majorité des prédictions tombent sur la bonne classe. Les confusions résiduelles concernent principalement deux paires de causes physiquement proches : usure moteur avec échauffement carte — les deux produisent une signature thermique — et courroie détendue avec désalignement lame — les deux produisent une signature vibratoire. Ces confusions sont attendues et acceptables ; l'intervention corrective couvre souvent les deux hypothèses en même temps.</w:t>
-      </w:r>
-    </w:p>
-    <w:p>
-      <w:pPr>
-        <w:spacing w:before="40" w:after="120"/>
-        <w:pBdr>
-          <w:bottom w:val="single" w:sz="6" w:color="B0B0B0" w:space="1"/>
-        </w:pBdr>
-      </w:pPr>
-    </w:p>
-    <w:p>
-      <w:pPr>
-        <w:pStyle w:val="Heading1"/>
-        <w:keepNext/>
-        <w:spacing w:before="400" w:after="160"/>
-        <w:pBdr>
-          <w:bottom w:val="single" w:sz="12" w:color="1F4E79" w:space="2"/>
-        </w:pBdr>
-      </w:pPr>
-      <w:r>
-        <w:rPr>
-          <w:b/>
-          <w:color w:val="1F4E79"/>
-          <w:sz w:val="36"/>
-        </w:rPr>
-        <w:t>23 — Fonctionnalités web (45 s)</w:t>
-      </w:r>
-    </w:p>
-    <w:p>
-      <w:pPr>
-        <w:spacing w:before="120" w:after="160" w:line="312" w:lineRule="auto"/>
-        <w:ind w:left="170" w:right="170"/>
-        <w:pBdr>
-          <w:left w:val="single" w:sz="28" w:space="10" w:color="FF7A1A"/>
-        </w:pBdr>
-        <w:shd w:val="clear" w:color="auto" w:fill="FFF3E6"/>
-      </w:pPr>
-      <w:r>
-        <w:rPr>
-          <w:color w:val="000000"/>
-          <w:sz w:val="23"/>
-        </w:rPr>
-        <w:t>L'application web s'adresse principalement au responsable de maintenance. Six modules la structurent. Un tableau de bord temps réel avec les indicateurs MTBF et MTTR par machine. Une gestion complète des machines et de leur historique. Un module d'interventions avec workflow d'assignation. Un planning préventif calendaire. Un centre d'alertes avec filtrage et acquittement. Un module de fiabilité prévisionnelle avec génération de rapport PDF. L'ensemble respecte le référentiel de permissions unique côté backend.</w:t>
-      </w:r>
-    </w:p>
-    <w:p>
-      <w:pPr>
-        <w:spacing w:before="40" w:after="120"/>
-        <w:pBdr>
-          <w:bottom w:val="single" w:sz="6" w:color="B0B0B0" w:space="1"/>
-        </w:pBdr>
-      </w:pPr>
-    </w:p>
-    <w:p>
-      <w:pPr>
-        <w:pStyle w:val="Heading1"/>
-        <w:keepNext/>
-        <w:spacing w:before="400" w:after="160"/>
-        <w:pBdr>
-          <w:bottom w:val="single" w:sz="12" w:color="1F4E79" w:space="2"/>
-        </w:pBdr>
-      </w:pPr>
-      <w:r>
-        <w:rPr>
-          <w:b/>
-          <w:color w:val="1F4E79"/>
-          <w:sz w:val="36"/>
-        </w:rPr>
-        <w:t>24 — Web · exemples d'écrans (40 s)</w:t>
-      </w:r>
-    </w:p>
-    <w:p>
-      <w:pPr>
-        <w:spacing w:before="120" w:after="160" w:line="312" w:lineRule="auto"/>
-        <w:ind w:left="170" w:right="170"/>
-        <w:pBdr>
-          <w:left w:val="single" w:sz="28" w:space="10" w:color="FF7A1A"/>
-        </w:pBdr>
-        <w:shd w:val="clear" w:color="auto" w:fill="FFF3E6"/>
-      </w:pPr>
-      <w:r>
-        <w:rPr>
-          <w:color w:val="000000"/>
-          <w:sz w:val="23"/>
-        </w:rPr>
-        <w:t>Voici quelques écrans clés. Le tableau de bord présente les KPI par machine avec code couleur — vert nominal, orange dégradé, rouge critique. Le détail machine agrège son historique, sa checklist préventive en cours et ses interventions passées. L'écran interventions liste chaque événement avec un badge IA quand la maintenance a été créée automatiquement par le modèle. Le module fiabilité génère un PDF signé prêt à archiver.</w:t>
-      </w:r>
-    </w:p>
-    <w:p>
-      <w:pPr>
-        <w:spacing w:before="40" w:after="120"/>
-        <w:pBdr>
-          <w:bottom w:val="single" w:sz="6" w:color="B0B0B0" w:space="1"/>
-        </w:pBdr>
-      </w:pPr>
-    </w:p>
-    <w:p>
-      <w:pPr>
-        <w:pStyle w:val="Heading1"/>
-        <w:keepNext/>
-        <w:spacing w:before="400" w:after="160"/>
-        <w:pBdr>
-          <w:bottom w:val="single" w:sz="12" w:color="1F4E79" w:space="2"/>
-        </w:pBdr>
-      </w:pPr>
-      <w:r>
-        <w:rPr>
-          <w:b/>
-          <w:color w:val="1F4E79"/>
-          <w:sz w:val="36"/>
-        </w:rPr>
-        <w:t>25 — Fonctionnalités mobile (40 s)</w:t>
-      </w:r>
-    </w:p>
-    <w:p>
-      <w:pPr>
-        <w:spacing w:before="120" w:after="160" w:line="312" w:lineRule="auto"/>
-        <w:ind w:left="170" w:right="170"/>
-        <w:pBdr>
-          <w:left w:val="single" w:sz="28" w:space="10" w:color="FF7A1A"/>
-        </w:pBdr>
-        <w:shd w:val="clear" w:color="auto" w:fill="FFF3E6"/>
-      </w:pPr>
-      <w:r>
-        <w:rPr>
-          <w:color w:val="000000"/>
-          <w:sz w:val="23"/>
-        </w:rPr>
-        <w:t>L'application mobile Flutter s'adresse au technicien terrain et au chef de ligne. Cinq écrans principaux : tableau de bord synthétique, liste des machines assignées, interventions en cours avec photos avant-après, alertes push en temps réel via Firebase Cloud Messaging, profil utilisateur. La contrainte forte : chaque preuve photographique doit être prise depuis la caméra native — pas de galerie — pour garantir la traçabilité de l'intervention.</w:t>
-      </w:r>
-    </w:p>
-    <w:p>
-      <w:pPr>
-        <w:spacing w:before="40" w:after="120"/>
-        <w:pBdr>
-          <w:bottom w:val="single" w:sz="6" w:color="B0B0B0" w:space="1"/>
-        </w:pBdr>
-      </w:pPr>
-    </w:p>
-    <w:p>
-      <w:pPr>
-        <w:pStyle w:val="Heading1"/>
-        <w:keepNext/>
-        <w:spacing w:before="400" w:after="160"/>
-        <w:pBdr>
-          <w:bottom w:val="single" w:sz="12" w:color="1F4E79" w:space="2"/>
-        </w:pBdr>
-      </w:pPr>
-      <w:r>
-        <w:rPr>
-          <w:b/>
-          <w:color w:val="1F4E79"/>
-          <w:sz w:val="36"/>
-        </w:rPr>
-        <w:t>26 — Mobile · exemples d'écrans (40 s)</w:t>
-      </w:r>
-    </w:p>
-    <w:p>
-      <w:pPr>
-        <w:spacing w:before="120" w:after="160" w:line="312" w:lineRule="auto"/>
-        <w:ind w:left="170" w:right="170"/>
-        <w:pBdr>
-          <w:left w:val="single" w:sz="28" w:space="10" w:color="FF7A1A"/>
-        </w:pBdr>
-        <w:shd w:val="clear" w:color="auto" w:fill="FFF3E6"/>
-      </w:pPr>
-      <w:r>
-        <w:rPr>
-          <w:color w:val="000000"/>
-          <w:sz w:val="23"/>
-        </w:rPr>
-        <w:t>Voici les écrans mobile. La liste d'interventions présente chaque tâche avec priorité et machine associée. L'écran détail permet de saisir un état, joindre deux photos — avant et après — et signer la clôture. Les alertes remontent instantanément avec vibration et son distinctif. La checklist préventive quotidienne — sous forme de grille par équipement — verrouille automatiquement chaque ligne après commit pour éviter les modifications concurrentes.</w:t>
-      </w:r>
-    </w:p>
-    <w:p>
-      <w:pPr>
-        <w:spacing w:before="40" w:after="120"/>
-        <w:pBdr>
-          <w:bottom w:val="single" w:sz="6" w:color="B0B0B0" w:space="1"/>
-        </w:pBdr>
-      </w:pPr>
-    </w:p>
-    <w:p>
-      <w:pPr>
-        <w:pStyle w:val="Heading1"/>
-        <w:keepNext/>
-        <w:spacing w:before="400" w:after="160"/>
-        <w:pBdr>
-          <w:bottom w:val="single" w:sz="12" w:color="1F4E79" w:space="2"/>
-        </w:pBdr>
-      </w:pPr>
-      <w:r>
-        <w:rPr>
-          <w:b/>
-          <w:color w:val="1F4E79"/>
-          <w:sz w:val="36"/>
-        </w:rPr>
-        <w:t>27 — Analyse de fiabilité (40 s)</w:t>
-      </w:r>
-    </w:p>
-    <w:p>
-      <w:pPr>
-        <w:spacing w:before="120" w:after="160" w:line="312" w:lineRule="auto"/>
-        <w:ind w:left="170" w:right="170"/>
-        <w:pBdr>
-          <w:left w:val="single" w:sz="28" w:space="10" w:color="FF7A1A"/>
-        </w:pBdr>
-        <w:shd w:val="clear" w:color="auto" w:fill="FFF3E6"/>
-      </w:pPr>
-      <w:r>
-        <w:rPr>
-          <w:color w:val="000000"/>
-          <w:sz w:val="23"/>
-        </w:rPr>
-        <w:t>Le module de fiabilité aide à la décision d'investissement. Il agrège pour chaque machine : nombre de pannes sur période, temps moyen entre pannes, taux de disponibilité, projection à trois mois via régression linéaire. Un rapport PDF est généré côté serveur et téléchargeable depuis le web comme depuis le mobile. La recommandation finale — conserver, surveiller, remplacer — repose sur la disponibilité et le nombre de pannes, sans intégrer de dimension monétaire par choix méthodologique.</w:t>
-      </w:r>
-    </w:p>
-    <w:p>
-      <w:pPr>
-        <w:spacing w:before="40" w:after="120"/>
-        <w:pBdr>
-          <w:bottom w:val="single" w:sz="6" w:color="B0B0B0" w:space="1"/>
-        </w:pBdr>
-      </w:pPr>
-    </w:p>
-    <w:p>
-      <w:pPr>
-        <w:pStyle w:val="Heading1"/>
-        <w:keepNext/>
-        <w:spacing w:before="400" w:after="160"/>
-        <w:pBdr>
-          <w:bottom w:val="single" w:sz="12" w:color="1F4E79" w:space="2"/>
-        </w:pBdr>
-      </w:pPr>
-      <w:r>
-        <w:rPr>
-          <w:b/>
-          <w:color w:val="1F4E79"/>
-          <w:sz w:val="36"/>
-        </w:rPr>
-        <w:t>28 — Déploiement (35 s)</w:t>
-      </w:r>
-    </w:p>
-    <w:p>
-      <w:pPr>
-        <w:spacing w:before="120" w:after="160" w:line="312" w:lineRule="auto"/>
-        <w:ind w:left="170" w:right="170"/>
-        <w:pBdr>
-          <w:left w:val="single" w:sz="28" w:space="10" w:color="FF7A1A"/>
-        </w:pBdr>
-        <w:shd w:val="clear" w:color="auto" w:fill="FFF3E6"/>
-      </w:pPr>
-      <w:r>
-        <w:rPr>
-          <w:color w:val="000000"/>
-          <w:sz w:val="23"/>
-        </w:rPr>
-        <w:t xml:space="preserve">Le backend Express et le microservice FastAPI sont déployés sur </w:t>
+        <w:t xml:space="preserve"> répond à une seule question : dérive dans les 2 heures ? F1 </w:t>
       </w:r>
       <w:r>
         <w:rPr>
@@ -1898,29 +2346,29 @@
           <w:color w:val="000000"/>
           <w:sz w:val="23"/>
         </w:rPr>
-        <w:t>Render</w:t>
+        <w:t>0,84</w:t>
       </w:r>
       <w:r>
         <w:rPr>
           <w:color w:val="000000"/>
           <w:sz w:val="23"/>
         </w:rPr>
-        <w:t xml:space="preserve"> — plateforme cloud gérée. La base MongoDB tourne sur MongoDB Atlas, cluster gratuit région Europe. Les processus sont supervisés par PM2 en local pour le développement, par Render pour la production. Un endpoint </w:t>
+        <w:t xml:space="preserve">, accuracy </w:t>
       </w:r>
       <w:r>
         <w:rPr>
-          <w:rFonts w:ascii="Consolas" w:hAnsi="Consolas"/>
-          <w:color w:val="2A2A2A"/>
-          <w:sz w:val="20"/>
+          <w:b/>
+          <w:color w:val="000000"/>
+          <w:sz w:val="23"/>
         </w:rPr>
-        <w:t>/health</w:t>
+        <w:t>0,95</w:t>
       </w:r>
       <w:r>
         <w:rPr>
           <w:color w:val="000000"/>
           <w:sz w:val="23"/>
         </w:rPr>
-        <w:t xml:space="preserve"> permet la vérification externe. Le mobile Flutter est distribué en APK signé, l'application web est livrée en build statique servi par Nginx.</w:t>
+        <w:t>. C'est lui qui déclenche l'alerte. Voyons les erreurs du Random Forest v2.</w:t>
       </w:r>
     </w:p>
     <w:p>
@@ -1946,7 +2394,471 @@
           <w:color w:val="1F4E79"/>
           <w:sz w:val="36"/>
         </w:rPr>
-        <w:t>29 — Section 5 · Démonstration (5 s)</w:t>
+        <w:t>31 — Matrice de confusion (30 s)</w:t>
+      </w:r>
+    </w:p>
+    <w:p>
+      <w:pPr>
+        <w:spacing w:before="120" w:after="160" w:line="312" w:lineRule="auto"/>
+        <w:ind w:left="170" w:right="170"/>
+        <w:pBdr>
+          <w:left w:val="single" w:sz="28" w:space="10" w:color="FF7A1A"/>
+        </w:pBdr>
+        <w:shd w:val="clear" w:color="auto" w:fill="FFF3E6"/>
+      </w:pPr>
+      <w:r>
+        <w:rPr>
+          <w:color w:val="000000"/>
+          <w:sz w:val="23"/>
+        </w:rPr>
+        <w:t xml:space="preserve">Chaque ligne montre où vont les cas réels d'une cause. Sur la diagonale, les causes fortes sont bien reconnues : moteur </w:t>
+      </w:r>
+      <w:r>
+        <w:rPr>
+          <w:b/>
+          <w:color w:val="000000"/>
+          <w:sz w:val="23"/>
+        </w:rPr>
+        <w:t>86 %</w:t>
+      </w:r>
+      <w:r>
+        <w:rPr>
+          <w:color w:val="000000"/>
+          <w:sz w:val="23"/>
+        </w:rPr>
+        <w:t xml:space="preserve">, casse </w:t>
+      </w:r>
+      <w:r>
+        <w:rPr>
+          <w:b/>
+          <w:color w:val="000000"/>
+          <w:sz w:val="23"/>
+        </w:rPr>
+        <w:t>71 %</w:t>
+      </w:r>
+      <w:r>
+        <w:rPr>
+          <w:color w:val="000000"/>
+          <w:sz w:val="23"/>
+        </w:rPr>
+        <w:t xml:space="preserve">. Les causes se confondent peu entre elles. L'erreur principale est la dernière colonne : une panne lue comme « Normal ». C'est le cas de C08, C09 et C13, à </w:t>
+      </w:r>
+      <w:r>
+        <w:rPr>
+          <w:b/>
+          <w:color w:val="000000"/>
+          <w:sz w:val="23"/>
+        </w:rPr>
+        <w:t>69 à 84 %</w:t>
+      </w:r>
+      <w:r>
+        <w:rPr>
+          <w:color w:val="000000"/>
+          <w:sz w:val="23"/>
+        </w:rPr>
+        <w:t>, car elles ne laissent aucune trace sur les capteurs. Pour XGBoost, on regarde la courbe ROC.</w:t>
+      </w:r>
+    </w:p>
+    <w:p>
+      <w:pPr>
+        <w:spacing w:before="40" w:after="120"/>
+        <w:pBdr>
+          <w:bottom w:val="single" w:sz="6" w:color="B0B0B0" w:space="1"/>
+        </w:pBdr>
+      </w:pPr>
+    </w:p>
+    <w:p>
+      <w:pPr>
+        <w:pStyle w:val="Heading1"/>
+        <w:keepNext/>
+        <w:spacing w:before="400" w:after="160"/>
+        <w:pBdr>
+          <w:bottom w:val="single" w:sz="12" w:color="1F4E79" w:space="2"/>
+        </w:pBdr>
+      </w:pPr>
+      <w:r>
+        <w:rPr>
+          <w:b/>
+          <w:color w:val="1F4E79"/>
+          <w:sz w:val="36"/>
+        </w:rPr>
+        <w:t>32 — Courbe ROC (30 s)</w:t>
+      </w:r>
+    </w:p>
+    <w:p>
+      <w:pPr>
+        <w:spacing w:before="120" w:after="160" w:line="312" w:lineRule="auto"/>
+        <w:ind w:left="170" w:right="170"/>
+        <w:pBdr>
+          <w:left w:val="single" w:sz="28" w:space="10" w:color="FF7A1A"/>
+        </w:pBdr>
+        <w:shd w:val="clear" w:color="auto" w:fill="FFF3E6"/>
+      </w:pPr>
+      <w:r>
+        <w:rPr>
+          <w:color w:val="000000"/>
+          <w:sz w:val="23"/>
+        </w:rPr>
+        <w:t xml:space="preserve">À gauche, la </w:t>
+      </w:r>
+      <w:r>
+        <w:rPr>
+          <w:b/>
+          <w:color w:val="000000"/>
+          <w:sz w:val="23"/>
+        </w:rPr>
+        <w:t>courbe ROC</w:t>
+      </w:r>
+      <w:r>
+        <w:rPr>
+          <w:color w:val="000000"/>
+          <w:sz w:val="23"/>
+        </w:rPr>
+        <w:t xml:space="preserve"> du XGBoost v3 : l'AUC est de </w:t>
+      </w:r>
+      <w:r>
+        <w:rPr>
+          <w:b/>
+          <w:color w:val="000000"/>
+          <w:sz w:val="23"/>
+        </w:rPr>
+        <w:t>0,978</w:t>
+      </w:r>
+      <w:r>
+        <w:rPr>
+          <w:color w:val="000000"/>
+          <w:sz w:val="23"/>
+        </w:rPr>
+        <w:t xml:space="preserve">, le modèle sépare très bien dérive et état normal. À droite, les probabilités prédites : en bleu le normal, en rouge la pré-panne. Les 2 seuils viennent de ce graphique. À </w:t>
+      </w:r>
+      <w:r>
+        <w:rPr>
+          <w:b/>
+          <w:color w:val="000000"/>
+          <w:sz w:val="23"/>
+        </w:rPr>
+        <w:t>60 %</w:t>
+      </w:r>
+      <w:r>
+        <w:rPr>
+          <w:color w:val="000000"/>
+          <w:sz w:val="23"/>
+        </w:rPr>
+        <w:t xml:space="preserve">, une alerte d'avertissement : on accepte quelques fausses alertes. À </w:t>
+      </w:r>
+      <w:r>
+        <w:rPr>
+          <w:b/>
+          <w:color w:val="000000"/>
+          <w:sz w:val="23"/>
+        </w:rPr>
+        <w:t>80 %</w:t>
+      </w:r>
+      <w:r>
+        <w:rPr>
+          <w:color w:val="000000"/>
+          <w:sz w:val="23"/>
+        </w:rPr>
+        <w:t>, une alerte critique et une maintenance prédictive automatique. Ces prédictions arrivent ensuite chez l'utilisateur, d'abord sur le web.</w:t>
+      </w:r>
+    </w:p>
+    <w:p>
+      <w:pPr>
+        <w:spacing w:before="40" w:after="120"/>
+        <w:pBdr>
+          <w:bottom w:val="single" w:sz="6" w:color="B0B0B0" w:space="1"/>
+        </w:pBdr>
+      </w:pPr>
+    </w:p>
+    <w:p>
+      <w:pPr>
+        <w:pStyle w:val="Heading1"/>
+        <w:keepNext/>
+        <w:spacing w:before="400" w:after="160"/>
+        <w:pBdr>
+          <w:bottom w:val="single" w:sz="12" w:color="1F4E79" w:space="2"/>
+        </w:pBdr>
+      </w:pPr>
+      <w:r>
+        <w:rPr>
+          <w:b/>
+          <w:color w:val="1F4E79"/>
+          <w:sz w:val="36"/>
+        </w:rPr>
+        <w:t>33 — Fonctionnalités web (30 s)</w:t>
+      </w:r>
+    </w:p>
+    <w:p>
+      <w:pPr>
+        <w:spacing w:before="120" w:after="160" w:line="312" w:lineRule="auto"/>
+        <w:ind w:left="170" w:right="170"/>
+        <w:pBdr>
+          <w:left w:val="single" w:sz="28" w:space="10" w:color="FF7A1A"/>
+        </w:pBdr>
+        <w:shd w:val="clear" w:color="auto" w:fill="FFF3E6"/>
+      </w:pPr>
+      <w:r>
+        <w:rPr>
+          <w:color w:val="000000"/>
+          <w:sz w:val="23"/>
+        </w:rPr>
+        <w:t>L'application web sert les 3 profils : responsable maintenance, chef de ligne et technicien. Elle a 6 modules. Le tableau de bord montre MTBF, MTTR et disponibilité. La page Équipements affiche les 13 machines et leurs capteurs en direct. Les interventions ont un bouton « Diagnostiquer avec l'IA ». Viennent ensuite la maintenance préventive, le suivi journalier FOR MAI 52, puis la fiabilité avec son rapport PDF et les alertes. Voici quelques écrans.</w:t>
+      </w:r>
+    </w:p>
+    <w:p>
+      <w:pPr>
+        <w:spacing w:before="40" w:after="120"/>
+        <w:pBdr>
+          <w:bottom w:val="single" w:sz="6" w:color="B0B0B0" w:space="1"/>
+        </w:pBdr>
+      </w:pPr>
+    </w:p>
+    <w:p>
+      <w:pPr>
+        <w:pStyle w:val="Heading1"/>
+        <w:keepNext/>
+        <w:spacing w:before="400" w:after="160"/>
+        <w:pBdr>
+          <w:bottom w:val="single" w:sz="12" w:color="1F4E79" w:space="2"/>
+        </w:pBdr>
+      </w:pPr>
+      <w:r>
+        <w:rPr>
+          <w:b/>
+          <w:color w:val="1F4E79"/>
+          <w:sz w:val="36"/>
+        </w:rPr>
+        <w:t>34 — Web · exemples d'écrans (30 s)</w:t>
+      </w:r>
+    </w:p>
+    <w:p>
+      <w:pPr>
+        <w:spacing w:before="120" w:after="160" w:line="312" w:lineRule="auto"/>
+        <w:ind w:left="170" w:right="170"/>
+        <w:pBdr>
+          <w:left w:val="single" w:sz="28" w:space="10" w:color="FF7A1A"/>
+        </w:pBdr>
+        <w:shd w:val="clear" w:color="auto" w:fill="FFF3E6"/>
+      </w:pPr>
+      <w:r>
+        <w:rPr>
+          <w:color w:val="000000"/>
+          <w:sz w:val="23"/>
+        </w:rPr>
+        <w:t>Voici les écrans réels, vus par le responsable maintenance. Le tableau de bord résume les équipements, les interventions et la disponibilité. La fiche d'une machine affiche ses 4 capteurs en direct, rafraîchis toutes les 30 secondes. Les interventions sont classées en préventive, corrective et prédictive. La page Alertes montre les prédictions de l'IA : probabilité de panne et cause suggérée. Enfin, Analyses donne MTBF, MTTR et disponibilité. Passons au mobile.</w:t>
+      </w:r>
+    </w:p>
+    <w:p>
+      <w:pPr>
+        <w:spacing w:before="40" w:after="120"/>
+        <w:pBdr>
+          <w:bottom w:val="single" w:sz="6" w:color="B0B0B0" w:space="1"/>
+        </w:pBdr>
+      </w:pPr>
+    </w:p>
+    <w:p>
+      <w:pPr>
+        <w:pStyle w:val="Heading1"/>
+        <w:keepNext/>
+        <w:spacing w:before="400" w:after="160"/>
+        <w:pBdr>
+          <w:bottom w:val="single" w:sz="12" w:color="1F4E79" w:space="2"/>
+        </w:pBdr>
+      </w:pPr>
+      <w:r>
+        <w:rPr>
+          <w:b/>
+          <w:color w:val="1F4E79"/>
+          <w:sz w:val="36"/>
+        </w:rPr>
+        <w:t>35 — Fonctionnalités mobile (30 s)</w:t>
+      </w:r>
+    </w:p>
+    <w:p>
+      <w:pPr>
+        <w:spacing w:before="120" w:after="160" w:line="312" w:lineRule="auto"/>
+        <w:ind w:left="170" w:right="170"/>
+        <w:pBdr>
+          <w:left w:val="single" w:sz="28" w:space="10" w:color="FF7A1A"/>
+        </w:pBdr>
+        <w:shd w:val="clear" w:color="auto" w:fill="FFF3E6"/>
+      </w:pPr>
+      <w:r>
+        <w:rPr>
+          <w:color w:val="000000"/>
+          <w:sz w:val="23"/>
+        </w:rPr>
+        <w:t>L'application mobile Flutter sert le technicien et le chef de ligne, au pied de la machine. Elle reprend les modules clés du web. On y gère les interventions, avec photos avant et après. Le bouton « Diagnostiquer avec l'IA » marche aussi sur mobile. Le suivi journalier et les checklists préventives se remplissent sur le téléphone, avec une photo pour chaque contrôle. Enfin, Firebase envoie une notification push pour chaque alerte critique ou intervention assignée. Voici les écrans.</w:t>
+      </w:r>
+    </w:p>
+    <w:p>
+      <w:pPr>
+        <w:spacing w:before="40" w:after="120"/>
+        <w:pBdr>
+          <w:bottom w:val="single" w:sz="6" w:color="B0B0B0" w:space="1"/>
+        </w:pBdr>
+      </w:pPr>
+    </w:p>
+    <w:p>
+      <w:pPr>
+        <w:pStyle w:val="Heading1"/>
+        <w:keepNext/>
+        <w:spacing w:before="400" w:after="160"/>
+        <w:pBdr>
+          <w:bottom w:val="single" w:sz="12" w:color="1F4E79" w:space="2"/>
+        </w:pBdr>
+      </w:pPr>
+      <w:r>
+        <w:rPr>
+          <w:b/>
+          <w:color w:val="1F4E79"/>
+          <w:sz w:val="36"/>
+        </w:rPr>
+        <w:t>36 — Mobile · exemples d'écrans (30 s)</w:t>
+      </w:r>
+    </w:p>
+    <w:p>
+      <w:pPr>
+        <w:spacing w:before="120" w:after="160" w:line="312" w:lineRule="auto"/>
+        <w:ind w:left="170" w:right="170"/>
+        <w:pBdr>
+          <w:left w:val="single" w:sz="28" w:space="10" w:color="FF7A1A"/>
+        </w:pBdr>
+        <w:shd w:val="clear" w:color="auto" w:fill="FFF3E6"/>
+      </w:pPr>
+      <w:r>
+        <w:rPr>
+          <w:color w:val="000000"/>
+          <w:sz w:val="23"/>
+        </w:rPr>
+        <w:t>Voici les écrans réels sur Android. Le tableau de bord reprend les indicateurs du web. Les interventions s'affichent en cartes, avec leur type et leur état ; le responsable approuve celles en attente. Sur une intervention, le bouton « Diagnostiquer avec l'IA » donne la cause probable, la confiance et les 4 capteurs lus. Enfin, l'écran Alertes reçoit les notifications push, triées par criticité. Reste un module transverse : l'analyse de fiabilité.</w:t>
+      </w:r>
+    </w:p>
+    <w:p>
+      <w:pPr>
+        <w:spacing w:before="40" w:after="120"/>
+        <w:pBdr>
+          <w:bottom w:val="single" w:sz="6" w:color="B0B0B0" w:space="1"/>
+        </w:pBdr>
+      </w:pPr>
+    </w:p>
+    <w:p>
+      <w:pPr>
+        <w:pStyle w:val="Heading1"/>
+        <w:keepNext/>
+        <w:spacing w:before="400" w:after="160"/>
+        <w:pBdr>
+          <w:bottom w:val="single" w:sz="12" w:color="1F4E79" w:space="2"/>
+        </w:pBdr>
+      </w:pPr>
+      <w:r>
+        <w:rPr>
+          <w:b/>
+          <w:color w:val="1F4E79"/>
+          <w:sz w:val="36"/>
+        </w:rPr>
+        <w:t>37 — Analyse de fiabilité (30 s)</w:t>
+      </w:r>
+    </w:p>
+    <w:p>
+      <w:pPr>
+        <w:spacing w:before="120" w:after="160" w:line="312" w:lineRule="auto"/>
+        <w:ind w:left="170" w:right="170"/>
+        <w:pBdr>
+          <w:left w:val="single" w:sz="28" w:space="10" w:color="FF7A1A"/>
+        </w:pBdr>
+        <w:shd w:val="clear" w:color="auto" w:fill="FFF3E6"/>
+      </w:pPr>
+      <w:r>
+        <w:rPr>
+          <w:color w:val="000000"/>
+          <w:sz w:val="23"/>
+        </w:rPr>
+        <w:t>Le module de fiabilité aide à décider : garder une machine ou la renouveler. Pour chaque machine, il calcule MTBF, MTTR, disponibilité et nombre de pannes. Une régression linéaire projette la disponibilité sur 3 mois. Le backend en fait un rapport PDF, avec une recommandation : maintenir, surveiller, planifier le remplacement ou remplacer. Ici, la Gamma 333 : 99,2 % de disponibilité, recommandation « surveiller ». Pas de coûts en dinars : ils demandent la validation de la direction financière. Tout cela tourne sur une infrastructure locale.</w:t>
+      </w:r>
+    </w:p>
+    <w:p>
+      <w:pPr>
+        <w:spacing w:before="40" w:after="120"/>
+        <w:pBdr>
+          <w:bottom w:val="single" w:sz="6" w:color="B0B0B0" w:space="1"/>
+        </w:pBdr>
+      </w:pPr>
+    </w:p>
+    <w:p>
+      <w:pPr>
+        <w:pStyle w:val="Heading1"/>
+        <w:keepNext/>
+        <w:spacing w:before="400" w:after="160"/>
+        <w:pBdr>
+          <w:bottom w:val="single" w:sz="12" w:color="1F4E79" w:space="2"/>
+        </w:pBdr>
+      </w:pPr>
+      <w:r>
+        <w:rPr>
+          <w:b/>
+          <w:color w:val="1F4E79"/>
+          <w:sz w:val="36"/>
+        </w:rPr>
+        <w:t>38 — Déploiement (30 s)</w:t>
+      </w:r>
+    </w:p>
+    <w:p>
+      <w:pPr>
+        <w:spacing w:before="120" w:after="160" w:line="312" w:lineRule="auto"/>
+        <w:ind w:left="170" w:right="170"/>
+        <w:pBdr>
+          <w:left w:val="single" w:sz="28" w:space="10" w:color="FF7A1A"/>
+        </w:pBdr>
+        <w:shd w:val="clear" w:color="auto" w:fill="FFF3E6"/>
+      </w:pPr>
+      <w:r>
+        <w:rPr>
+          <w:color w:val="000000"/>
+          <w:sz w:val="23"/>
+        </w:rPr>
+        <w:t xml:space="preserve">Tout est déployé sur le </w:t>
+      </w:r>
+      <w:r>
+        <w:rPr>
+          <w:b/>
+          <w:color w:val="000000"/>
+          <w:sz w:val="23"/>
+        </w:rPr>
+        <w:t>serveur interne d'ICEM</w:t>
+      </w:r>
+      <w:r>
+        <w:rPr>
+          <w:color w:val="000000"/>
+          <w:sz w:val="23"/>
+        </w:rPr>
+        <w:t>. Un Windows Server héberge le backend, l'application web et la base MongoDB. Le backend tourne comme service Windows avec NSSM ; le web est publié sous IIS. MongoDB n'écoute que le réseau interne. Le Raspberry Pi et les téléphones passent par le Wi-Fi d'usine ; le mobile est installé par APK. Seules les notifications Firebase sortent du réseau. Les données de production restent donc chez ICEM. Passons à la démonstration.</w:t>
+      </w:r>
+    </w:p>
+    <w:p>
+      <w:pPr>
+        <w:spacing w:before="40" w:after="120"/>
+        <w:pBdr>
+          <w:bottom w:val="single" w:sz="6" w:color="B0B0B0" w:space="1"/>
+        </w:pBdr>
+      </w:pPr>
+    </w:p>
+    <w:p>
+      <w:pPr>
+        <w:pStyle w:val="Heading1"/>
+        <w:keepNext/>
+        <w:spacing w:before="400" w:after="160"/>
+        <w:pBdr>
+          <w:bottom w:val="single" w:sz="12" w:color="1F4E79" w:space="2"/>
+        </w:pBdr>
+      </w:pPr>
+      <w:r>
+        <w:rPr>
+          <w:b/>
+          <w:color w:val="1F4E79"/>
+          <w:sz w:val="36"/>
+        </w:rPr>
+        <w:t>39 — Section 5 · Démonstration (5 s)</w:t>
       </w:r>
     </w:p>
     <w:p>
@@ -1989,7 +2901,7 @@
           <w:color w:val="1F4E79"/>
           <w:sz w:val="36"/>
         </w:rPr>
-        <w:t>30 — KPI et résultats (45 s)</w:t>
+        <w:t>40 — KPI et résultats (30 s)</w:t>
       </w:r>
     </w:p>
     <w:p>
@@ -2006,7 +2918,7 @@
           <w:color w:val="000000"/>
           <w:sz w:val="23"/>
         </w:rPr>
-        <w:t>Récapitulatif chiffré. Cinq capteurs par machine, quatre familles de mesure. Soixante-quatre mille huit cents échantillons d'entraînement. XGBoost à zéro virgule quatre-vingt-treize de F1 macro. Latence bout-en-bout inférieure à une seconde. Deux applications — web et mobile — synchronisées sur la même API. Un microservice IA autonome, redéployable indépendamment. Un rapport de fiabilité PDF généré à la demande. L'objectif initial des trois axes — instrumenter, prédire, restituer — est atteint sur le périmètre défini.</w:t>
+        <w:t>En chiffres : une architecture en 5 couches, de la perception à l'application. 5 capteurs par machine. 4 modèles d'apprentissage ; le XGBoost atteint 0,84 de F1 sur la dérive, avec une AUC de 0,978. Moins d'une seconde entre la mesure et l'alerte. 2 applications sur la même API, testée par plus de 120 requêtes Postman. Les 3 objectifs sont atteints : instrumenter, prédire, restituer. Ces chiffres nous amènent à la conclusion.</w:t>
       </w:r>
     </w:p>
     <w:p>
@@ -2032,7 +2944,7 @@
           <w:color w:val="1F4E79"/>
           <w:sz w:val="36"/>
         </w:rPr>
-        <w:t>31 — Perspectives (40 s)</w:t>
+        <w:t>41 — Conclusion (30 s)</w:t>
       </w:r>
     </w:p>
     <w:p>
@@ -2049,7 +2961,67 @@
           <w:color w:val="000000"/>
           <w:sz w:val="23"/>
         </w:rPr>
-        <w:t>Trois axes d'évolution se dessinent. Un — l'installation physique complète des capteurs sur les deux machines, avec ré-entraînement du modèle sur les données réelles collectées sur trois mois. Deux — l'extension à d'autres familles de machines du parc ICEM, notamment les sertisseuses CFA. Trois — l'ajout d'une couche de recommandation prescriptive : proposer directement l'action corrective optimale, pas seulement détecter la panne. À plus long terme, une passerelle vers le SI GMAO existant pour clôturer la boucle de gestion.</w:t>
+        <w:t xml:space="preserve">En conclusion, nous livrons un </w:t>
+      </w:r>
+      <w:r>
+        <w:rPr>
+          <w:b/>
+          <w:color w:val="000000"/>
+          <w:sz w:val="23"/>
+        </w:rPr>
+        <w:t>prototype opérationnel</w:t>
+      </w:r>
+      <w:r>
+        <w:rPr>
+          <w:color w:val="000000"/>
+          <w:sz w:val="23"/>
+        </w:rPr>
+        <w:t xml:space="preserve"> sur 3 axes. </w:t>
+      </w:r>
+      <w:r>
+        <w:rPr>
+          <w:b/>
+          <w:color w:val="000000"/>
+          <w:sz w:val="23"/>
+        </w:rPr>
+        <w:t>1</w:t>
+      </w:r>
+      <w:r>
+        <w:rPr>
+          <w:color w:val="000000"/>
+          <w:sz w:val="23"/>
+        </w:rPr>
+        <w:t xml:space="preserve"> — instrumenter : 5 capteurs par machine, moins d'une seconde de la mesure à l'alerte. </w:t>
+      </w:r>
+      <w:r>
+        <w:rPr>
+          <w:b/>
+          <w:color w:val="000000"/>
+          <w:sz w:val="23"/>
+        </w:rPr>
+        <w:t>2</w:t>
+      </w:r>
+      <w:r>
+        <w:rPr>
+          <w:color w:val="000000"/>
+          <w:sz w:val="23"/>
+        </w:rPr>
+        <w:t xml:space="preserve"> — prédire : le Random Forest trouve la cause parmi 13, le XGBoost atteint 0,84 de F1 ; au-delà de 80 %, une maintenance prédictive est créée automatiquement. </w:t>
+      </w:r>
+      <w:r>
+        <w:rPr>
+          <w:b/>
+          <w:color w:val="000000"/>
+          <w:sz w:val="23"/>
+        </w:rPr>
+        <w:t>3</w:t>
+      </w:r>
+      <w:r>
+        <w:rPr>
+          <w:color w:val="000000"/>
+          <w:sz w:val="23"/>
+        </w:rPr>
+        <w:t xml:space="preserve"> — restituer : web et mobile sur la même API, notifications push, rapport de fiabilité, le tout déployé chez ICEM. Place aux perspectives.</w:t>
       </w:r>
     </w:p>
     <w:p>
@@ -2075,7 +3047,7 @@
           <w:color w:val="1F4E79"/>
           <w:sz w:val="36"/>
         </w:rPr>
-        <w:t>32 — Merci (30 s)</w:t>
+        <w:t>42 — Perspectives (30 s)</w:t>
       </w:r>
     </w:p>
     <w:p>
@@ -2092,7 +3064,110 @@
           <w:color w:val="000000"/>
           <w:sz w:val="23"/>
         </w:rPr>
-        <w:t>Je vous remercie pour votre attention. Je remercie également Monsieur Imed Hidri pour son encadrement académique, Monsieur Yassine Hammami pour son encadrement société, ainsi que l'équipe ICEM Nabeul qui m'a accueilli pendant ces six mois. Je suis à votre disposition pour toutes vos questions.</w:t>
+        <w:t xml:space="preserve">Première étape : ré-entraîner les modèles avec les vraies mesures des capteurs. Ensuite, 4 pistes. </w:t>
+      </w:r>
+      <w:r>
+        <w:rPr>
+          <w:b/>
+          <w:color w:val="000000"/>
+          <w:sz w:val="23"/>
+        </w:rPr>
+        <w:t>1</w:t>
+      </w:r>
+      <w:r>
+        <w:rPr>
+          <w:color w:val="000000"/>
+          <w:sz w:val="23"/>
+        </w:rPr>
+        <w:t xml:space="preserve"> — l'Edge AI : faire tourner XGBoost sur le Raspberry Pi, même sans réseau. </w:t>
+      </w:r>
+      <w:r>
+        <w:rPr>
+          <w:b/>
+          <w:color w:val="000000"/>
+          <w:sz w:val="23"/>
+        </w:rPr>
+        <w:t>2</w:t>
+      </w:r>
+      <w:r>
+        <w:rPr>
+          <w:color w:val="000000"/>
+          <w:sz w:val="23"/>
+        </w:rPr>
+        <w:t xml:space="preserve"> — l'intégration HMI : lire les alarmes de la machine Komax et les croiser avec notre diagnostic. </w:t>
+      </w:r>
+      <w:r>
+        <w:rPr>
+          <w:b/>
+          <w:color w:val="000000"/>
+          <w:sz w:val="23"/>
+        </w:rPr>
+        <w:t>3</w:t>
+      </w:r>
+      <w:r>
+        <w:rPr>
+          <w:color w:val="000000"/>
+          <w:sz w:val="23"/>
+        </w:rPr>
+        <w:t xml:space="preserve"> — la vision industrielle : une caméra et un réseau CNN pour les défauts de sertissage. </w:t>
+      </w:r>
+      <w:r>
+        <w:rPr>
+          <w:b/>
+          <w:color w:val="000000"/>
+          <w:sz w:val="23"/>
+        </w:rPr>
+        <w:t>4</w:t>
+      </w:r>
+      <w:r>
+        <w:rPr>
+          <w:color w:val="000000"/>
+          <w:sz w:val="23"/>
+        </w:rPr>
+        <w:t xml:space="preserve"> — la maintenance prescriptive : proposer l'action, les pièces et le bon créneau.</w:t>
+      </w:r>
+    </w:p>
+    <w:p>
+      <w:pPr>
+        <w:spacing w:before="40" w:after="120"/>
+        <w:pBdr>
+          <w:bottom w:val="single" w:sz="6" w:color="B0B0B0" w:space="1"/>
+        </w:pBdr>
+      </w:pPr>
+    </w:p>
+    <w:p>
+      <w:pPr>
+        <w:pStyle w:val="Heading1"/>
+        <w:keepNext/>
+        <w:spacing w:before="400" w:after="160"/>
+        <w:pBdr>
+          <w:bottom w:val="single" w:sz="12" w:color="1F4E79" w:space="2"/>
+        </w:pBdr>
+      </w:pPr>
+      <w:r>
+        <w:rPr>
+          <w:b/>
+          <w:color w:val="1F4E79"/>
+          <w:sz w:val="36"/>
+        </w:rPr>
+        <w:t>43 — Merci (30 s)</w:t>
+      </w:r>
+    </w:p>
+    <w:p>
+      <w:pPr>
+        <w:spacing w:before="120" w:after="160" w:line="312" w:lineRule="auto"/>
+        <w:ind w:left="170" w:right="170"/>
+        <w:pBdr>
+          <w:left w:val="single" w:sz="28" w:space="10" w:color="FF7A1A"/>
+        </w:pBdr>
+        <w:shd w:val="clear" w:color="auto" w:fill="FFF3E6"/>
+      </w:pPr>
+      <w:r>
+        <w:rPr>
+          <w:color w:val="000000"/>
+          <w:sz w:val="23"/>
+        </w:rPr>
+        <w:t>Je vous remercie pour votre attention. Je remercie également Monsieur Imed Hidri pour son encadrement académique, Monsieur Yassine Hammami pour son encadrement société, ainsi que l'équipe ICEM Nabeul qui m'a accueilli pendant ces 6 mois. Je suis à votre disposition pour toutes vos questions.</w:t>
       </w:r>
     </w:p>
     <w:p>
@@ -2404,7 +3479,7 @@
               <w:rPr>
                 <w:sz w:val="21"/>
               </w:rPr>
-              <w:t>4</w:t>
+              <w:t>6</w:t>
             </w:r>
           </w:p>
         </w:tc>
@@ -2427,7 +3502,7 @@
               <w:rPr>
                 <w:sz w:val="21"/>
               </w:rPr>
-              <w:t>2 min 05</w:t>
+              <w:t>4 min 05</w:t>
             </w:r>
           </w:p>
         </w:tc>
@@ -2478,7 +3553,7 @@
               <w:rPr>
                 <w:sz w:val="21"/>
               </w:rPr>
-              <w:t>5</w:t>
+              <w:t>10</w:t>
             </w:r>
           </w:p>
         </w:tc>
@@ -2502,7 +3577,7 @@
               <w:rPr>
                 <w:sz w:val="21"/>
               </w:rPr>
-              <w:t>3 min 05</w:t>
+              <w:t>5 min 15</w:t>
             </w:r>
           </w:p>
         </w:tc>
@@ -2551,7 +3626,7 @@
               <w:rPr>
                 <w:sz w:val="21"/>
               </w:rPr>
-              <w:t>12</w:t>
+              <w:t>14</w:t>
             </w:r>
           </w:p>
         </w:tc>
@@ -2574,7 +3649,7 @@
               <w:rPr>
                 <w:sz w:val="21"/>
               </w:rPr>
-              <w:t>8 min 15</w:t>
+              <w:t>9 min 15</w:t>
             </w:r>
           </w:p>
         </w:tc>
@@ -2698,7 +3773,7 @@
               <w:rPr>
                 <w:sz w:val="21"/>
               </w:rPr>
-              <w:t>4</w:t>
+              <w:t>5</w:t>
             </w:r>
           </w:p>
         </w:tc>
@@ -2721,7 +3796,7 @@
               <w:rPr>
                 <w:sz w:val="21"/>
               </w:rPr>
-              <w:t>2 min 00</w:t>
+              <w:t>2 min 40</w:t>
             </w:r>
           </w:p>
         </w:tc>
@@ -2773,7 +3848,7 @@
                 <w:b/>
                 <w:sz w:val="21"/>
               </w:rPr>
-              <w:t>33</w:t>
+              <w:t>43</w:t>
             </w:r>
           </w:p>
         </w:tc>
@@ -2798,7 +3873,7 @@
                 <w:b/>
                 <w:sz w:val="21"/>
               </w:rPr>
-              <w:t>~20 min</w:t>
+              <w:t>~25 min</w:t>
             </w:r>
           </w:p>
         </w:tc>

</xml_diff>

<commit_message>
feat: Add UML diagrams and web functionalities slides
- Created UMLClasses.jsx and UMLUseCase.jsx for class and use case diagrams.
- Added Web_Fonctionnalites.jsx to showcase web application features.
- Updated index.js to include new slides in the presentation flow.
- Added ICEM logo and new SVG logos for machine learning models.
- Enhanced PipelineFlow.jsx with improved visual connections between steps.
- Refined various sensor slides by removing redundant information and improving layout.
- Updated Stack.jsx to include new machine learning models with improved styling for logos.
</commit_message>
<xml_diff>
--- a/SPEECH_FR.docx
+++ b/SPEECH_FR.docx
@@ -1200,7 +1200,22 @@
           <w:color w:val="000000"/>
           <w:sz w:val="23"/>
         </w:rPr>
-        <w:t xml:space="preserve"> : Python avec FastAPI, scikit-learn pour les modèles Random Forest, XGBoost pour la classification fine des causes. Côté </w:t>
+        <w:t xml:space="preserve"> : Python avec FastAPI, scikit-learn et XGBoost, pour </w:t>
+      </w:r>
+      <w:r>
+        <w:rPr>
+          <w:b/>
+          <w:color w:val="000000"/>
+          <w:sz w:val="23"/>
+        </w:rPr>
+        <w:t>3 modèles</w:t>
+      </w:r>
+      <w:r>
+        <w:rPr>
+          <w:color w:val="000000"/>
+          <w:sz w:val="23"/>
+        </w:rPr>
+        <w:t xml:space="preserve"> : Random Forest pour la cause de la panne, XGBoost pour la panne dans les 24 heures, et une régression linéaire pour la fiabilité. Côté </w:t>
       </w:r>
       <w:r>
         <w:rPr>
@@ -1522,7 +1537,7 @@
           <w:color w:val="000000"/>
           <w:sz w:val="23"/>
         </w:rPr>
-        <w:t>, en contact direct avec le carter métallique. Un second DHT22 se trouve à l'intérieur de l'armoire électrique pour la température ambiante. Pourquoi cette position ? Parce que le moteur chauffe avant tout autre composant en cas de problème mécanique — roulement fatigué, sur-effort, défaut de lubrification. Un contact direct donne une lecture rapide, non atténuée par l'air, ce qui maximise la sensibilité aux dérives précoces.</w:t>
+        <w:t>, en contact direct avec le carter métallique. Pourquoi cette position ? Parce que le moteur chauffe avant tout autre composant en cas de problème mécanique — roulement fatigué, sur-effort, défaut de lubrification. Un contact direct donne une lecture rapide, non atténuée par l'air, ce qui maximise la sensibilité aux dérives précoces.</w:t>
       </w:r>
     </w:p>
     <w:p>
@@ -1724,7 +1739,7 @@
           <w:color w:val="1F4E79"/>
           <w:sz w:val="36"/>
         </w:rPr>
-        <w:t>21 — SCT-013 · emplacement (35 s)</w:t>
+        <w:t>21 — Armoire électrique · SCT-013 + DHT22 (40 s)</w:t>
       </w:r>
     </w:p>
     <w:p>
@@ -1741,7 +1756,7 @@
           <w:color w:val="000000"/>
           <w:sz w:val="23"/>
         </w:rPr>
-        <w:t xml:space="preserve">Voici où la </w:t>
+        <w:t>Voici l'</w:t>
       </w:r>
       <w:r>
         <w:rPr>
@@ -1749,14 +1764,14 @@
           <w:color w:val="000000"/>
           <w:sz w:val="23"/>
         </w:rPr>
-        <w:t>pince SCT-013</w:t>
+        <w:t>armoire électrique</w:t>
       </w:r>
       <w:r>
         <w:rPr>
           <w:color w:val="000000"/>
           <w:sz w:val="23"/>
         </w:rPr>
-        <w:t xml:space="preserve"> est installée. On la voit ici — la pince bleue — clampée autour d'un câble à l'intérieur de l'armoire électrique. Le signal, converti en tension par une résistance de charge de 33 ohms, est ramené au Raspberry Pi, visible dans le paquet essai en bas, via le convertisseur </w:t>
+        <w:t xml:space="preserve">. On y voit 2 capteurs. D'abord la </w:t>
       </w:r>
       <w:r>
         <w:rPr>
@@ -1764,14 +1779,44 @@
           <w:color w:val="000000"/>
           <w:sz w:val="23"/>
         </w:rPr>
-        <w:t>ADS1015 12 bits</w:t>
+        <w:t>pince SCT-013</w:t>
       </w:r>
       <w:r>
         <w:rPr>
           <w:color w:val="000000"/>
           <w:sz w:val="23"/>
         </w:rPr>
-        <w:t xml:space="preserve"> posé sur la breadboard. Pourquoi cette position ? Parce que ce câble porte le courant tiré par les moteurs — une seule pince suffit à obtenir une vision agrégée de l'état électrique. Comme la mesure est non-invasive, la pose et le retrait se font sans interruption de production. La couche physique posée, passons à la modélisation logicielle du système.</w:t>
+        <w:t xml:space="preserve"> — la pince bleue — clampée autour d'un câble. Ensuite un </w:t>
+      </w:r>
+      <w:r>
+        <w:rPr>
+          <w:b/>
+          <w:color w:val="000000"/>
+          <w:sz w:val="23"/>
+        </w:rPr>
+        <w:t>second DHT22</w:t>
+      </w:r>
+      <w:r>
+        <w:rPr>
+          <w:color w:val="000000"/>
+          <w:sz w:val="23"/>
+        </w:rPr>
+        <w:t xml:space="preserve">, qui mesure la température ambiante de l'armoire. Le signal, converti en tension par une résistance de charge de 33 ohms, est ramené au Raspberry Pi, visible dans le paquet essai en bas, via le convertisseur </w:t>
+      </w:r>
+      <w:r>
+        <w:rPr>
+          <w:b/>
+          <w:color w:val="000000"/>
+          <w:sz w:val="23"/>
+        </w:rPr>
+        <w:t>ADS1015 12 bits</w:t>
+      </w:r>
+      <w:r>
+        <w:rPr>
+          <w:color w:val="000000"/>
+          <w:sz w:val="23"/>
+        </w:rPr>
+        <w:t xml:space="preserve"> posé sur la breadboard. Pourquoi cette position ? Parce que ce câble porte le courant tiré par les moteurs — une seule pince suffit à obtenir une vision agrégée de l'état électrique. Comme la mesure est non-invasive, la pose et le retrait se font sans interruption de production. Le DHT22, lui, surveille l'échauffement de l'électronique de l'armoire. La couche physique posée, passons à la modélisation logicielle du système.</w:t>
       </w:r>
     </w:p>
     <w:p>
@@ -1797,7 +1842,7 @@
           <w:color w:val="1F4E79"/>
           <w:sz w:val="36"/>
         </w:rPr>
-        <w:t>22 — Diagramme de cas d'utilisation (30 s)</w:t>
+        <w:t>22 — Diagramme de cas d'utilisation (25 s)</w:t>
       </w:r>
     </w:p>
     <w:p>
@@ -1829,7 +1874,7 @@
           <w:color w:val="000000"/>
           <w:sz w:val="23"/>
         </w:rPr>
-        <w:t xml:space="preserve"> identifie 6 acteurs : 3 acteurs humains — Responsable Maintenance, Chef de Ligne, Technicien — et 3 acteurs système — le Système IA Maintenance, le Système IA Analyse de fiabilité et l'IoT. Ils interviennent sur </w:t>
+        <w:t xml:space="preserve"> montre </w:t>
       </w:r>
       <w:r>
         <w:rPr>
@@ -1837,14 +1882,44 @@
           <w:color w:val="000000"/>
           <w:sz w:val="23"/>
         </w:rPr>
-        <w:t>12 cas d'utilisation</w:t>
+        <w:t>6 acteurs</w:t>
       </w:r>
       <w:r>
         <w:rPr>
           <w:color w:val="000000"/>
           <w:sz w:val="23"/>
         </w:rPr>
-        <w:t>. Le responsable gère les machines, les comptes utilisateurs et la maintenance. Le chef de ligne surveille l'état des machines et supervise les alertes. Le technicien reçoit les notifications d'alerte et gère les interventions. Côté système, l'IA analyse les pannes et suggère les causes, l'analyse de fiabilité recommande le maintien ou le renouvellement d'une machine, et l'IoT collecte les données capteurs. Toutes les actions humaines passent par l'authentification. Ces cas d'utilisation s'appuient sur 9 classes.</w:t>
+        <w:t xml:space="preserve"> et </w:t>
+      </w:r>
+      <w:r>
+        <w:rPr>
+          <w:b/>
+          <w:color w:val="000000"/>
+          <w:sz w:val="23"/>
+        </w:rPr>
+        <w:t>12 cas d'utilisation</w:t>
+      </w:r>
+      <w:r>
+        <w:rPr>
+          <w:color w:val="000000"/>
+          <w:sz w:val="23"/>
+        </w:rPr>
+        <w:t>. 3 acteurs humains : le responsable maintenance, le chef de ligne et le technicien. 3 acteurs système : l'IA maintenance, l'IA analyse de fiabilité et l'IoT. Chaque action humaine passe d'abord par l'</w:t>
+      </w:r>
+      <w:r>
+        <w:rPr>
+          <w:b/>
+          <w:color w:val="000000"/>
+          <w:sz w:val="23"/>
+        </w:rPr>
+        <w:t>authentification</w:t>
+      </w:r>
+      <w:r>
+        <w:rPr>
+          <w:color w:val="000000"/>
+          <w:sz w:val="23"/>
+        </w:rPr>
+        <w:t>. Ces cas d'utilisation s'appuient sur 9 classes.</w:t>
       </w:r>
     </w:p>
     <w:p>
@@ -1870,7 +1945,7 @@
           <w:color w:val="1F4E79"/>
           <w:sz w:val="36"/>
         </w:rPr>
-        <w:t>23 — Diagramme de classes (30 s)</w:t>
+        <w:t>23 — Diagramme de classes (25 s)</w:t>
       </w:r>
     </w:p>
     <w:p>
@@ -1902,7 +1977,7 @@
           <w:color w:val="000000"/>
           <w:sz w:val="23"/>
         </w:rPr>
-        <w:t xml:space="preserve"> modélise </w:t>
+        <w:t xml:space="preserve"> contient </w:t>
       </w:r>
       <w:r>
         <w:rPr>
@@ -1917,7 +1992,7 @@
           <w:color w:val="000000"/>
           <w:sz w:val="23"/>
         </w:rPr>
-        <w:t xml:space="preserve">, en 3 groupes. Le cœur métier : Utilisateur, Ligne, Machine, Maintenance et Alerte. La couche IoT : Capteur et RaspberryPi. La couche IA : AnalyseIA pour le diagnostic des pannes, et AnalyseTCO pour l'analyse de fiabilité. Ces classes structurent la base MongoDB. Choix de conception marquant : une seule classe Maintenance porte un </w:t>
+        <w:t xml:space="preserve"> en 3 groupes. Le métier : utilisateur, ligne, machine, maintenance et alerte. L'IoT : capteur et Raspberry Pi. L'IA : analyse des pannes et analyse de fiabilité. Une seule classe Maintenance porte un </w:t>
       </w:r>
       <w:r>
         <w:rPr>
@@ -1925,14 +2000,14 @@
           <w:color w:val="000000"/>
           <w:sz w:val="23"/>
         </w:rPr>
-        <w:t>type énuméré</w:t>
+        <w:t>type</w:t>
       </w:r>
       <w:r>
         <w:rPr>
           <w:color w:val="000000"/>
           <w:sz w:val="23"/>
         </w:rPr>
-        <w:t xml:space="preserve"> à 5 valeurs — préventive, corrective, prédictive, checklist journalière et checklist préventive — plutôt que 5 classes séparées. Cela simplifie les requêtes et unifie le workflow d'assignation. Ces entités s'enchaînent en temps réel selon un pipeline précis.</w:t>
+        <w:t xml:space="preserve"> à 5 valeurs, au lieu de 5 classes séparées. Ces classes s'enchaînent dans un pipeline temps réel.</w:t>
       </w:r>
     </w:p>
     <w:p>
@@ -2664,7 +2739,7 @@
           <w:color w:val="1F4E79"/>
           <w:sz w:val="36"/>
         </w:rPr>
-        <w:t>31 — Matrice de confusion (30 s)</w:t>
+        <w:t>31 — Matrice de confusion (35 s)</w:t>
       </w:r>
     </w:p>
     <w:p>
@@ -2681,7 +2756,112 @@
           <w:color w:val="000000"/>
           <w:sz w:val="23"/>
         </w:rPr>
-        <w:t>Chaque ligne montre où vont les cas réels d'une cause. Les erreurs sont logiques. La plupart vont vers « Normal » : au début, la panne est encore trop faible. La courroie est parfois prise pour une usure : les 2 font vibrer. La surcharge est parfois prise pour une ventilation encrassée : les 2 chauffent le moteur. Passons au XGBoost.</w:t>
+        <w:t xml:space="preserve">Sur l'axe vertical, la </w:t>
+      </w:r>
+      <w:r>
+        <w:rPr>
+          <w:b/>
+          <w:color w:val="000000"/>
+          <w:sz w:val="23"/>
+        </w:rPr>
+        <w:t>cause réelle</w:t>
+      </w:r>
+      <w:r>
+        <w:rPr>
+          <w:color w:val="000000"/>
+          <w:sz w:val="23"/>
+        </w:rPr>
+        <w:t xml:space="preserve">. Sur l'axe horizontal, la </w:t>
+      </w:r>
+      <w:r>
+        <w:rPr>
+          <w:b/>
+          <w:color w:val="000000"/>
+          <w:sz w:val="23"/>
+        </w:rPr>
+        <w:t>cause prédite</w:t>
+      </w:r>
+      <w:r>
+        <w:rPr>
+          <w:color w:val="000000"/>
+          <w:sz w:val="23"/>
+        </w:rPr>
+        <w:t xml:space="preserve"> par le modèle. Chaque case donne la part des cas réels de la ligne. La </w:t>
+      </w:r>
+      <w:r>
+        <w:rPr>
+          <w:b/>
+          <w:color w:val="000000"/>
+          <w:sz w:val="23"/>
+        </w:rPr>
+        <w:t>diagonale</w:t>
+      </w:r>
+      <w:r>
+        <w:rPr>
+          <w:color w:val="000000"/>
+          <w:sz w:val="23"/>
+        </w:rPr>
+        <w:t xml:space="preserve"> foncée, ce sont les bonnes réponses : par exemple </w:t>
+      </w:r>
+      <w:r>
+        <w:rPr>
+          <w:b/>
+          <w:color w:val="000000"/>
+          <w:sz w:val="23"/>
+        </w:rPr>
+        <w:t>0,92</w:t>
+      </w:r>
+      <w:r>
+        <w:rPr>
+          <w:color w:val="000000"/>
+          <w:sz w:val="23"/>
+        </w:rPr>
+        <w:t xml:space="preserve"> pour la surchauffe armoire. L'erreur principale est dans la colonne </w:t>
+      </w:r>
+      <w:r>
+        <w:rPr>
+          <w:b/>
+          <w:color w:val="000000"/>
+          <w:sz w:val="23"/>
+        </w:rPr>
+        <w:t>« Normal »</w:t>
+      </w:r>
+      <w:r>
+        <w:rPr>
+          <w:color w:val="000000"/>
+          <w:sz w:val="23"/>
+        </w:rPr>
+        <w:t xml:space="preserve"> : </w:t>
+      </w:r>
+      <w:r>
+        <w:rPr>
+          <w:b/>
+          <w:color w:val="000000"/>
+          <w:sz w:val="23"/>
+        </w:rPr>
+        <w:t>0,39</w:t>
+      </w:r>
+      <w:r>
+        <w:rPr>
+          <w:color w:val="000000"/>
+          <w:sz w:val="23"/>
+        </w:rPr>
+        <w:t xml:space="preserve"> pour l'usure, car au début la panne est encore trop faible. Autre point : </w:t>
+      </w:r>
+      <w:r>
+        <w:rPr>
+          <w:b/>
+          <w:color w:val="000000"/>
+          <w:sz w:val="23"/>
+        </w:rPr>
+        <w:t>0,16</w:t>
+      </w:r>
+      <w:r>
+        <w:rPr>
+          <w:color w:val="000000"/>
+          <w:sz w:val="23"/>
+        </w:rPr>
+        <w:t xml:space="preserve"> de courroie lue comme usure, car les 2 font vibrer. Passons au XGBoost.</w:t>
       </w:r>
     </w:p>
     <w:p>
@@ -2707,7 +2887,7 @@
           <w:color w:val="1F4E79"/>
           <w:sz w:val="36"/>
         </w:rPr>
-        <w:t>32 — XGBoost · panne dans 24 h (30 s)</w:t>
+        <w:t>32 — XGBoost · panne dans 24 h (40 s)</w:t>
       </w:r>
     </w:p>
     <w:p>
@@ -2724,7 +2904,7 @@
           <w:color w:val="000000"/>
           <w:sz w:val="23"/>
         </w:rPr>
-        <w:t xml:space="preserve">Le XGBoost a une </w:t>
+        <w:t xml:space="preserve">À gauche, la </w:t>
       </w:r>
       <w:r>
         <w:rPr>
@@ -2732,14 +2912,14 @@
           <w:color w:val="000000"/>
           <w:sz w:val="23"/>
         </w:rPr>
-        <w:t>AUC de 0,94</w:t>
+        <w:t>courbe ROC</w:t>
       </w:r>
       <w:r>
         <w:rPr>
           <w:color w:val="000000"/>
           <w:sz w:val="23"/>
         </w:rPr>
-        <w:t xml:space="preserve">. Pour l'atelier, le plus important : sur </w:t>
+        <w:t xml:space="preserve">. En x, le taux de </w:t>
       </w:r>
       <w:r>
         <w:rPr>
@@ -2747,14 +2927,14 @@
           <w:color w:val="000000"/>
           <w:sz w:val="23"/>
         </w:rPr>
-        <w:t>69 pannes</w:t>
+        <w:t>fausses alertes</w:t>
       </w:r>
       <w:r>
         <w:rPr>
           <w:color w:val="000000"/>
           <w:sz w:val="23"/>
         </w:rPr>
-        <w:t xml:space="preserve">, les </w:t>
+        <w:t xml:space="preserve">. En y, le taux de </w:t>
       </w:r>
       <w:r>
         <w:rPr>
@@ -2762,14 +2942,14 @@
           <w:color w:val="000000"/>
           <w:sz w:val="23"/>
         </w:rPr>
-        <w:t>69</w:t>
+        <w:t>pannes détectées</w:t>
       </w:r>
       <w:r>
         <w:rPr>
           <w:color w:val="000000"/>
           <w:sz w:val="23"/>
         </w:rPr>
-        <w:t xml:space="preserve"> ont été annoncées, avec </w:t>
+        <w:t>. La courbe monte vite vers le coin en haut à gauche : beaucoup de pannes détectées, peu de fausses alertes. La ligne pointillée, c'est le hasard. L'aire sous la courbe donne l'</w:t>
       </w:r>
       <w:r>
         <w:rPr>
@@ -2777,14 +2957,14 @@
           <w:color w:val="000000"/>
           <w:sz w:val="23"/>
         </w:rPr>
-        <w:t>19,5 heures</w:t>
+        <w:t>AUC : 0,94</w:t>
       </w:r>
       <w:r>
         <w:rPr>
           <w:color w:val="000000"/>
           <w:sz w:val="23"/>
         </w:rPr>
-        <w:t xml:space="preserve"> d'avance en médiane. Sur une machine saine, on a environ </w:t>
+        <w:t xml:space="preserve">. À droite, en x la </w:t>
       </w:r>
       <w:r>
         <w:rPr>
@@ -2792,14 +2972,14 @@
           <w:color w:val="000000"/>
           <w:sz w:val="23"/>
         </w:rPr>
-        <w:t>1 fausse alerte par semaine</w:t>
+        <w:t>probabilité prédite</w:t>
       </w:r>
       <w:r>
         <w:rPr>
           <w:color w:val="000000"/>
           <w:sz w:val="23"/>
         </w:rPr>
-        <w:t xml:space="preserve">. Les 2 seuils viennent de ce graphique : </w:t>
+        <w:t xml:space="preserve">, en y la densité. Le bleu, pas de panne, reste près de 0. L'orange, panne dans 24 h, monte près de 1. Les 2 traits pointillés sont nos seuils : </w:t>
       </w:r>
       <w:r>
         <w:rPr>
@@ -2814,7 +2994,7 @@
           <w:color w:val="000000"/>
           <w:sz w:val="23"/>
         </w:rPr>
-        <w:t xml:space="preserve"> pour une alerte, </w:t>
+        <w:t xml:space="preserve"> alerte, </w:t>
       </w:r>
       <w:r>
         <w:rPr>
@@ -2829,7 +3009,37 @@
           <w:color w:val="000000"/>
           <w:sz w:val="23"/>
         </w:rPr>
-        <w:t xml:space="preserve"> pour une intervention prédictive. Ces prédictions arrivent ensuite chez l'utilisateur, d'abord sur le web.</w:t>
+        <w:t xml:space="preserve"> intervention prédictive. Résultat : </w:t>
+      </w:r>
+      <w:r>
+        <w:rPr>
+          <w:b/>
+          <w:color w:val="000000"/>
+          <w:sz w:val="23"/>
+        </w:rPr>
+        <w:t>69 pannes sur 69</w:t>
+      </w:r>
+      <w:r>
+        <w:rPr>
+          <w:color w:val="000000"/>
+          <w:sz w:val="23"/>
+        </w:rPr>
+        <w:t xml:space="preserve"> annoncées, </w:t>
+      </w:r>
+      <w:r>
+        <w:rPr>
+          <w:b/>
+          <w:color w:val="000000"/>
+          <w:sz w:val="23"/>
+        </w:rPr>
+        <w:t>19,5 heures</w:t>
+      </w:r>
+      <w:r>
+        <w:rPr>
+          <w:color w:val="000000"/>
+          <w:sz w:val="23"/>
+        </w:rPr>
+        <w:t xml:space="preserve"> avant en médiane. Ces prédictions arrivent ensuite sur le web.</w:t>
       </w:r>
     </w:p>
     <w:p>

</xml_diff>